<commit_message>
analyza struktury dat, uprava dat, novy typ souboru pro ukladani (.rds)
</commit_message>
<xml_diff>
--- a/textove_soubory/postup_prace.docx
+++ b/textove_soubory/postup_prace.docx
@@ -685,17 +685,2542 @@
     </w:p>
     <w:p>
       <w:pPr>
+        <w:pStyle w:val="Nadpis3"/>
+      </w:pPr>
+      <w:r>
+        <w:t>Ovzduší</w:t>
+      </w:r>
+    </w:p>
+    <w:p>
+      <w:r>
+        <w:t>Dataset obsahuje 524</w:t>
+      </w:r>
+      <w:r>
+        <w:rPr>
+          <w:rFonts w:ascii="Arial" w:hAnsi="Arial" w:cs="Arial"/>
+        </w:rPr>
+        <w:t> </w:t>
+      </w:r>
+      <w:r>
+        <w:t xml:space="preserve">025 </w:t>
+      </w:r>
+      <w:r>
+        <w:rPr>
+          <w:rFonts w:ascii="Aptos" w:hAnsi="Aptos" w:cs="Aptos"/>
+        </w:rPr>
+        <w:t>řá</w:t>
+      </w:r>
+      <w:r>
+        <w:t>dk</w:t>
+      </w:r>
+      <w:r>
+        <w:rPr>
+          <w:rFonts w:ascii="Aptos" w:hAnsi="Aptos" w:cs="Aptos"/>
+        </w:rPr>
+        <w:t>ů</w:t>
+      </w:r>
+      <w:r>
+        <w:t xml:space="preserve"> a 18 sloupců. Každý záznam představuje jedno měření koncentrace z konkrétního senzoru v konkrétním čase. Měření pokrývá období od 1. 1. 2024 do 7. 2. 2025 (celkem cca 404 dní). V rámci jednoho dne se pohybuje počet záznamů od cca 330 do 2370.</w:t>
+      </w:r>
+    </w:p>
+    <w:p>
+      <w:r>
+        <w:t>Klíčové proměnné:</w:t>
+      </w:r>
+    </w:p>
+    <w:p>
+      <w:pPr>
+        <w:numPr>
+          <w:ilvl w:val="0"/>
+          <w:numId w:val="9"/>
+        </w:numPr>
+      </w:pPr>
+      <w:r>
+        <w:t>data_pm10, data_pm25, data_pm40, data_pm100 – koncentrace prachových částic v jednotkách µg/m³</w:t>
+      </w:r>
+    </w:p>
+    <w:p>
+      <w:pPr>
+        <w:numPr>
+          <w:ilvl w:val="0"/>
+          <w:numId w:val="9"/>
+        </w:numPr>
+      </w:pPr>
+      <w:r>
+        <w:t>data_no2 – koncentrace oxidu dusičitého (~50 % záznamů chybí)</w:t>
+      </w:r>
+    </w:p>
+    <w:p>
+      <w:pPr>
+        <w:numPr>
+          <w:ilvl w:val="0"/>
+          <w:numId w:val="9"/>
+        </w:numPr>
+      </w:pPr>
+      <w:r>
+        <w:t>recommendation_metrics_*_index – doporučení k expozici dané látce (hodnoty 1–6, ordinalní proměnné)</w:t>
+      </w:r>
+    </w:p>
+    <w:p>
+      <w:pPr>
+        <w:numPr>
+          <w:ilvl w:val="0"/>
+          <w:numId w:val="9"/>
+        </w:numPr>
+      </w:pPr>
+      <w:r>
+        <w:t>Proměnné data_o3, data_co, data_so2 obsahují pouze hodnotu NA, nebudou tedy dále využívány.</w:t>
+      </w:r>
+    </w:p>
+    <w:p>
+      <w:r>
+        <w:t>Proměnná date je ve formátu textu (character) a bude převedena na časový formát POSIXct. sensor_id identifikuje konkrétní měřicí zařízení.</w:t>
+      </w:r>
+    </w:p>
+    <w:p>
+      <w:r>
+        <w:t xml:space="preserve">Pět hlavních proměnných s koncentracemi látek v µg/m³ (data_pm10, data_pm25, data_pm40, data_pm100, data_no2) jsou </w:t>
+      </w:r>
+      <w:r>
+        <w:rPr>
+          <w:b/>
+          <w:bCs/>
+        </w:rPr>
+        <w:t>kvantitativní spojité</w:t>
+      </w:r>
+      <w:r>
+        <w:t xml:space="preserve"> proměnné. Shrnutí základních statistik:</w:t>
+      </w:r>
+    </w:p>
+    <w:tbl>
+      <w:tblPr>
+        <w:tblW w:w="0" w:type="auto"/>
+        <w:tblCellSpacing w:w="15" w:type="dxa"/>
+        <w:tblCellMar>
+          <w:top w:w="15" w:type="dxa"/>
+          <w:left w:w="15" w:type="dxa"/>
+          <w:bottom w:w="15" w:type="dxa"/>
+          <w:right w:w="15" w:type="dxa"/>
+        </w:tblCellMar>
+        <w:tblLook w:val="04A0" w:firstRow="1" w:lastRow="0" w:firstColumn="1" w:lastColumn="0" w:noHBand="0" w:noVBand="1"/>
+      </w:tblPr>
+      <w:tblGrid>
+        <w:gridCol w:w="1374"/>
+        <w:gridCol w:w="461"/>
+        <w:gridCol w:w="997"/>
+        <w:gridCol w:w="866"/>
+        <w:gridCol w:w="868"/>
+        <w:gridCol w:w="997"/>
+        <w:gridCol w:w="588"/>
+      </w:tblGrid>
+      <w:tr>
+        <w:trPr>
+          <w:tblHeader/>
+          <w:tblCellSpacing w:w="15" w:type="dxa"/>
+        </w:trPr>
+        <w:tc>
+          <w:tcPr>
+            <w:tcW w:w="0" w:type="auto"/>
+            <w:vAlign w:val="center"/>
+            <w:hideMark/>
+          </w:tcPr>
+          <w:p>
+            <w:pPr>
+              <w:rPr>
+                <w:b/>
+                <w:bCs/>
+              </w:rPr>
+            </w:pPr>
+            <w:r>
+              <w:rPr>
+                <w:b/>
+                <w:bCs/>
+              </w:rPr>
+              <w:t>Proměnná</w:t>
+            </w:r>
+          </w:p>
+        </w:tc>
+        <w:tc>
+          <w:tcPr>
+            <w:tcW w:w="0" w:type="auto"/>
+            <w:vAlign w:val="center"/>
+            <w:hideMark/>
+          </w:tcPr>
+          <w:p>
+            <w:pPr>
+              <w:rPr>
+                <w:b/>
+                <w:bCs/>
+              </w:rPr>
+            </w:pPr>
+            <w:r>
+              <w:rPr>
+                <w:b/>
+                <w:bCs/>
+              </w:rPr>
+              <w:t>Min</w:t>
+            </w:r>
+          </w:p>
+        </w:tc>
+        <w:tc>
+          <w:tcPr>
+            <w:tcW w:w="0" w:type="auto"/>
+            <w:vAlign w:val="center"/>
+            <w:hideMark/>
+          </w:tcPr>
+          <w:p>
+            <w:pPr>
+              <w:rPr>
+                <w:b/>
+                <w:bCs/>
+              </w:rPr>
+            </w:pPr>
+            <w:r>
+              <w:rPr>
+                <w:b/>
+                <w:bCs/>
+              </w:rPr>
+              <w:t>1. kvartil</w:t>
+            </w:r>
+          </w:p>
+        </w:tc>
+        <w:tc>
+          <w:tcPr>
+            <w:tcW w:w="0" w:type="auto"/>
+            <w:vAlign w:val="center"/>
+            <w:hideMark/>
+          </w:tcPr>
+          <w:p>
+            <w:pPr>
+              <w:rPr>
+                <w:b/>
+                <w:bCs/>
+              </w:rPr>
+            </w:pPr>
+            <w:r>
+              <w:rPr>
+                <w:b/>
+                <w:bCs/>
+              </w:rPr>
+              <w:t>Medián</w:t>
+            </w:r>
+          </w:p>
+        </w:tc>
+        <w:tc>
+          <w:tcPr>
+            <w:tcW w:w="0" w:type="auto"/>
+            <w:vAlign w:val="center"/>
+            <w:hideMark/>
+          </w:tcPr>
+          <w:p>
+            <w:pPr>
+              <w:rPr>
+                <w:b/>
+                <w:bCs/>
+              </w:rPr>
+            </w:pPr>
+            <w:r>
+              <w:rPr>
+                <w:b/>
+                <w:bCs/>
+              </w:rPr>
+              <w:t>Průměr</w:t>
+            </w:r>
+          </w:p>
+        </w:tc>
+        <w:tc>
+          <w:tcPr>
+            <w:tcW w:w="0" w:type="auto"/>
+            <w:vAlign w:val="center"/>
+            <w:hideMark/>
+          </w:tcPr>
+          <w:p>
+            <w:pPr>
+              <w:rPr>
+                <w:b/>
+                <w:bCs/>
+              </w:rPr>
+            </w:pPr>
+            <w:r>
+              <w:rPr>
+                <w:b/>
+                <w:bCs/>
+              </w:rPr>
+              <w:t>3. kvartil</w:t>
+            </w:r>
+          </w:p>
+        </w:tc>
+        <w:tc>
+          <w:tcPr>
+            <w:tcW w:w="0" w:type="auto"/>
+            <w:vAlign w:val="center"/>
+            <w:hideMark/>
+          </w:tcPr>
+          <w:p>
+            <w:pPr>
+              <w:rPr>
+                <w:b/>
+                <w:bCs/>
+              </w:rPr>
+            </w:pPr>
+            <w:r>
+              <w:rPr>
+                <w:b/>
+                <w:bCs/>
+              </w:rPr>
+              <w:t>Max</w:t>
+            </w:r>
+          </w:p>
+        </w:tc>
+      </w:tr>
+      <w:tr>
+        <w:trPr>
+          <w:tblCellSpacing w:w="15" w:type="dxa"/>
+        </w:trPr>
+        <w:tc>
+          <w:tcPr>
+            <w:tcW w:w="0" w:type="auto"/>
+            <w:vAlign w:val="center"/>
+            <w:hideMark/>
+          </w:tcPr>
+          <w:p>
+            <w:r>
+              <w:t>data_pm10</w:t>
+            </w:r>
+          </w:p>
+        </w:tc>
+        <w:tc>
+          <w:tcPr>
+            <w:tcW w:w="0" w:type="auto"/>
+            <w:vAlign w:val="center"/>
+            <w:hideMark/>
+          </w:tcPr>
+          <w:p>
+            <w:r>
+              <w:t>0</w:t>
+            </w:r>
+          </w:p>
+        </w:tc>
+        <w:tc>
+          <w:tcPr>
+            <w:tcW w:w="0" w:type="auto"/>
+            <w:vAlign w:val="center"/>
+            <w:hideMark/>
+          </w:tcPr>
+          <w:p>
+            <w:r>
+              <w:t>2</w:t>
+            </w:r>
+          </w:p>
+        </w:tc>
+        <w:tc>
+          <w:tcPr>
+            <w:tcW w:w="0" w:type="auto"/>
+            <w:vAlign w:val="center"/>
+            <w:hideMark/>
+          </w:tcPr>
+          <w:p>
+            <w:r>
+              <w:t>4</w:t>
+            </w:r>
+          </w:p>
+        </w:tc>
+        <w:tc>
+          <w:tcPr>
+            <w:tcW w:w="0" w:type="auto"/>
+            <w:vAlign w:val="center"/>
+            <w:hideMark/>
+          </w:tcPr>
+          <w:p>
+            <w:r>
+              <w:t>8.69</w:t>
+            </w:r>
+          </w:p>
+        </w:tc>
+        <w:tc>
+          <w:tcPr>
+            <w:tcW w:w="0" w:type="auto"/>
+            <w:vAlign w:val="center"/>
+            <w:hideMark/>
+          </w:tcPr>
+          <w:p>
+            <w:r>
+              <w:t>11</w:t>
+            </w:r>
+          </w:p>
+        </w:tc>
+        <w:tc>
+          <w:tcPr>
+            <w:tcW w:w="0" w:type="auto"/>
+            <w:vAlign w:val="center"/>
+            <w:hideMark/>
+          </w:tcPr>
+          <w:p>
+            <w:r>
+              <w:t>746</w:t>
+            </w:r>
+          </w:p>
+        </w:tc>
+      </w:tr>
+      <w:tr>
+        <w:trPr>
+          <w:tblCellSpacing w:w="15" w:type="dxa"/>
+        </w:trPr>
+        <w:tc>
+          <w:tcPr>
+            <w:tcW w:w="0" w:type="auto"/>
+            <w:vAlign w:val="center"/>
+            <w:hideMark/>
+          </w:tcPr>
+          <w:p>
+            <w:r>
+              <w:t>data_pm25</w:t>
+            </w:r>
+          </w:p>
+        </w:tc>
+        <w:tc>
+          <w:tcPr>
+            <w:tcW w:w="0" w:type="auto"/>
+            <w:vAlign w:val="center"/>
+            <w:hideMark/>
+          </w:tcPr>
+          <w:p>
+            <w:r>
+              <w:t>0</w:t>
+            </w:r>
+          </w:p>
+        </w:tc>
+        <w:tc>
+          <w:tcPr>
+            <w:tcW w:w="0" w:type="auto"/>
+            <w:vAlign w:val="center"/>
+            <w:hideMark/>
+          </w:tcPr>
+          <w:p>
+            <w:r>
+              <w:t>3</w:t>
+            </w:r>
+          </w:p>
+        </w:tc>
+        <w:tc>
+          <w:tcPr>
+            <w:tcW w:w="0" w:type="auto"/>
+            <w:vAlign w:val="center"/>
+            <w:hideMark/>
+          </w:tcPr>
+          <w:p>
+            <w:r>
+              <w:t>6</w:t>
+            </w:r>
+          </w:p>
+        </w:tc>
+        <w:tc>
+          <w:tcPr>
+            <w:tcW w:w="0" w:type="auto"/>
+            <w:vAlign w:val="center"/>
+            <w:hideMark/>
+          </w:tcPr>
+          <w:p>
+            <w:r>
+              <w:t>12.13</w:t>
+            </w:r>
+          </w:p>
+        </w:tc>
+        <w:tc>
+          <w:tcPr>
+            <w:tcW w:w="0" w:type="auto"/>
+            <w:vAlign w:val="center"/>
+            <w:hideMark/>
+          </w:tcPr>
+          <w:p>
+            <w:r>
+              <w:t>14</w:t>
+            </w:r>
+          </w:p>
+        </w:tc>
+        <w:tc>
+          <w:tcPr>
+            <w:tcW w:w="0" w:type="auto"/>
+            <w:vAlign w:val="center"/>
+            <w:hideMark/>
+          </w:tcPr>
+          <w:p>
+            <w:r>
+              <w:t>950</w:t>
+            </w:r>
+          </w:p>
+        </w:tc>
+      </w:tr>
+      <w:tr>
+        <w:trPr>
+          <w:tblCellSpacing w:w="15" w:type="dxa"/>
+        </w:trPr>
+        <w:tc>
+          <w:tcPr>
+            <w:tcW w:w="0" w:type="auto"/>
+            <w:vAlign w:val="center"/>
+            <w:hideMark/>
+          </w:tcPr>
+          <w:p>
+            <w:r>
+              <w:t>data_pm40</w:t>
+            </w:r>
+          </w:p>
+        </w:tc>
+        <w:tc>
+          <w:tcPr>
+            <w:tcW w:w="0" w:type="auto"/>
+            <w:vAlign w:val="center"/>
+            <w:hideMark/>
+          </w:tcPr>
+          <w:p>
+            <w:r>
+              <w:t>0</w:t>
+            </w:r>
+          </w:p>
+        </w:tc>
+        <w:tc>
+          <w:tcPr>
+            <w:tcW w:w="0" w:type="auto"/>
+            <w:vAlign w:val="center"/>
+            <w:hideMark/>
+          </w:tcPr>
+          <w:p>
+            <w:r>
+              <w:t>3</w:t>
+            </w:r>
+          </w:p>
+        </w:tc>
+        <w:tc>
+          <w:tcPr>
+            <w:tcW w:w="0" w:type="auto"/>
+            <w:vAlign w:val="center"/>
+            <w:hideMark/>
+          </w:tcPr>
+          <w:p>
+            <w:r>
+              <w:t>6</w:t>
+            </w:r>
+          </w:p>
+        </w:tc>
+        <w:tc>
+          <w:tcPr>
+            <w:tcW w:w="0" w:type="auto"/>
+            <w:vAlign w:val="center"/>
+            <w:hideMark/>
+          </w:tcPr>
+          <w:p>
+            <w:r>
+              <w:t>13.57</w:t>
+            </w:r>
+          </w:p>
+        </w:tc>
+        <w:tc>
+          <w:tcPr>
+            <w:tcW w:w="0" w:type="auto"/>
+            <w:vAlign w:val="center"/>
+            <w:hideMark/>
+          </w:tcPr>
+          <w:p>
+            <w:r>
+              <w:t>15</w:t>
+            </w:r>
+          </w:p>
+        </w:tc>
+        <w:tc>
+          <w:tcPr>
+            <w:tcW w:w="0" w:type="auto"/>
+            <w:vAlign w:val="center"/>
+            <w:hideMark/>
+          </w:tcPr>
+          <w:p>
+            <w:r>
+              <w:t>1765</w:t>
+            </w:r>
+          </w:p>
+        </w:tc>
+      </w:tr>
+      <w:tr>
+        <w:trPr>
+          <w:tblCellSpacing w:w="15" w:type="dxa"/>
+        </w:trPr>
+        <w:tc>
+          <w:tcPr>
+            <w:tcW w:w="0" w:type="auto"/>
+            <w:vAlign w:val="center"/>
+            <w:hideMark/>
+          </w:tcPr>
+          <w:p>
+            <w:r>
+              <w:t>data_pm100</w:t>
+            </w:r>
+          </w:p>
+        </w:tc>
+        <w:tc>
+          <w:tcPr>
+            <w:tcW w:w="0" w:type="auto"/>
+            <w:vAlign w:val="center"/>
+            <w:hideMark/>
+          </w:tcPr>
+          <w:p>
+            <w:r>
+              <w:t>0</w:t>
+            </w:r>
+          </w:p>
+        </w:tc>
+        <w:tc>
+          <w:tcPr>
+            <w:tcW w:w="0" w:type="auto"/>
+            <w:vAlign w:val="center"/>
+            <w:hideMark/>
+          </w:tcPr>
+          <w:p>
+            <w:r>
+              <w:t>3</w:t>
+            </w:r>
+          </w:p>
+        </w:tc>
+        <w:tc>
+          <w:tcPr>
+            <w:tcW w:w="0" w:type="auto"/>
+            <w:vAlign w:val="center"/>
+            <w:hideMark/>
+          </w:tcPr>
+          <w:p>
+            <w:r>
+              <w:t>7</w:t>
+            </w:r>
+          </w:p>
+        </w:tc>
+        <w:tc>
+          <w:tcPr>
+            <w:tcW w:w="0" w:type="auto"/>
+            <w:vAlign w:val="center"/>
+            <w:hideMark/>
+          </w:tcPr>
+          <w:p>
+            <w:r>
+              <w:t>15.47</w:t>
+            </w:r>
+          </w:p>
+        </w:tc>
+        <w:tc>
+          <w:tcPr>
+            <w:tcW w:w="0" w:type="auto"/>
+            <w:vAlign w:val="center"/>
+            <w:hideMark/>
+          </w:tcPr>
+          <w:p>
+            <w:r>
+              <w:t>16</w:t>
+            </w:r>
+          </w:p>
+        </w:tc>
+        <w:tc>
+          <w:tcPr>
+            <w:tcW w:w="0" w:type="auto"/>
+            <w:vAlign w:val="center"/>
+            <w:hideMark/>
+          </w:tcPr>
+          <w:p>
+            <w:r>
+              <w:t>1878</w:t>
+            </w:r>
+          </w:p>
+        </w:tc>
+      </w:tr>
+      <w:tr>
+        <w:trPr>
+          <w:tblCellSpacing w:w="15" w:type="dxa"/>
+        </w:trPr>
+        <w:tc>
+          <w:tcPr>
+            <w:tcW w:w="0" w:type="auto"/>
+            <w:vAlign w:val="center"/>
+            <w:hideMark/>
+          </w:tcPr>
+          <w:p>
+            <w:r>
+              <w:t>data_no2</w:t>
+            </w:r>
+          </w:p>
+        </w:tc>
+        <w:tc>
+          <w:tcPr>
+            <w:tcW w:w="0" w:type="auto"/>
+            <w:vAlign w:val="center"/>
+            <w:hideMark/>
+          </w:tcPr>
+          <w:p>
+            <w:r>
+              <w:t>0</w:t>
+            </w:r>
+          </w:p>
+        </w:tc>
+        <w:tc>
+          <w:tcPr>
+            <w:tcW w:w="0" w:type="auto"/>
+            <w:vAlign w:val="center"/>
+            <w:hideMark/>
+          </w:tcPr>
+          <w:p>
+            <w:r>
+              <w:t>6.9</w:t>
+            </w:r>
+          </w:p>
+        </w:tc>
+        <w:tc>
+          <w:tcPr>
+            <w:tcW w:w="0" w:type="auto"/>
+            <w:vAlign w:val="center"/>
+            <w:hideMark/>
+          </w:tcPr>
+          <w:p>
+            <w:r>
+              <w:t>11.95</w:t>
+            </w:r>
+          </w:p>
+        </w:tc>
+        <w:tc>
+          <w:tcPr>
+            <w:tcW w:w="0" w:type="auto"/>
+            <w:vAlign w:val="center"/>
+            <w:hideMark/>
+          </w:tcPr>
+          <w:p>
+            <w:r>
+              <w:t>14.83</w:t>
+            </w:r>
+          </w:p>
+        </w:tc>
+        <w:tc>
+          <w:tcPr>
+            <w:tcW w:w="0" w:type="auto"/>
+            <w:vAlign w:val="center"/>
+            <w:hideMark/>
+          </w:tcPr>
+          <w:p>
+            <w:r>
+              <w:t>18.61</w:t>
+            </w:r>
+          </w:p>
+        </w:tc>
+        <w:tc>
+          <w:tcPr>
+            <w:tcW w:w="0" w:type="auto"/>
+            <w:vAlign w:val="center"/>
+            <w:hideMark/>
+          </w:tcPr>
+          <w:p>
+            <w:r>
+              <w:t>2423</w:t>
+            </w:r>
+          </w:p>
+        </w:tc>
+      </w:tr>
+    </w:tbl>
+    <w:p>
+      <w:r>
+        <w:rPr>
+          <w:b/>
+          <w:bCs/>
+        </w:rPr>
+        <w:t>Kvantitativní spojité:</w:t>
+      </w:r>
+    </w:p>
+    <w:p>
+      <w:pPr>
+        <w:numPr>
+          <w:ilvl w:val="0"/>
+          <w:numId w:val="12"/>
+        </w:numPr>
+      </w:pPr>
+      <w:r>
+        <w:t>data_pm10, data_pm25, data_pm40, data_pm100, data_no2</w:t>
+      </w:r>
+    </w:p>
+    <w:p>
+      <w:r>
+        <w:rPr>
+          <w:b/>
+          <w:bCs/>
+        </w:rPr>
+        <w:t>Kvalitativní/Ordinalní (indexy 1–6):</w:t>
+      </w:r>
+    </w:p>
+    <w:p>
+      <w:pPr>
+        <w:numPr>
+          <w:ilvl w:val="0"/>
+          <w:numId w:val="13"/>
+        </w:numPr>
+      </w:pPr>
+      <w:r>
+        <w:lastRenderedPageBreak/>
+        <w:t>recommendation_index, recommendation_metrics_no2_index, recommendation_metrics_pm100_index, recommendation_metrics_pm25_index</w:t>
+      </w:r>
+    </w:p>
+    <w:p>
+      <w:r>
+        <w:rPr>
+          <w:b/>
+          <w:bCs/>
+        </w:rPr>
+        <w:t>Zajímavé rozdělení ordinalních proměnných (počet výskytů):</w:t>
+      </w:r>
+    </w:p>
+    <w:p>
+      <w:pPr>
+        <w:numPr>
+          <w:ilvl w:val="0"/>
+          <w:numId w:val="14"/>
+        </w:numPr>
+      </w:pPr>
+      <w:r>
+        <w:t>recommendation_index: Nejčastější hodnota je 1 (352</w:t>
+      </w:r>
+      <w:r>
+        <w:rPr>
+          <w:rFonts w:ascii="Arial" w:hAnsi="Arial" w:cs="Arial"/>
+        </w:rPr>
+        <w:t> </w:t>
+      </w:r>
+      <w:r>
+        <w:t>017x), ostatn</w:t>
+      </w:r>
+      <w:r>
+        <w:rPr>
+          <w:rFonts w:ascii="Aptos" w:hAnsi="Aptos" w:cs="Aptos"/>
+        </w:rPr>
+        <w:t>í</w:t>
+      </w:r>
+      <w:r>
+        <w:t xml:space="preserve"> rozlo</w:t>
+      </w:r>
+      <w:r>
+        <w:rPr>
+          <w:rFonts w:ascii="Aptos" w:hAnsi="Aptos" w:cs="Aptos"/>
+        </w:rPr>
+        <w:t>ž</w:t>
+      </w:r>
+      <w:r>
+        <w:t>eny rovnom</w:t>
+      </w:r>
+      <w:r>
+        <w:rPr>
+          <w:rFonts w:ascii="Aptos" w:hAnsi="Aptos" w:cs="Aptos"/>
+        </w:rPr>
+        <w:t>ě</w:t>
+      </w:r>
+      <w:r>
+        <w:t>rn</w:t>
+      </w:r>
+      <w:r>
+        <w:rPr>
+          <w:rFonts w:ascii="Aptos" w:hAnsi="Aptos" w:cs="Aptos"/>
+        </w:rPr>
+        <w:t>ě</w:t>
+      </w:r>
+      <w:r>
+        <w:t>ji.</w:t>
+      </w:r>
+    </w:p>
+    <w:p>
+      <w:pPr>
+        <w:numPr>
+          <w:ilvl w:val="0"/>
+          <w:numId w:val="14"/>
+        </w:numPr>
+      </w:pPr>
+      <w:r>
+        <w:t>recommendation_metrics_pm100_index: Hodnoty 1–6, přičemž 1 = 420</w:t>
+      </w:r>
+      <w:r>
+        <w:rPr>
+          <w:rFonts w:ascii="Arial" w:hAnsi="Arial" w:cs="Arial"/>
+        </w:rPr>
+        <w:t> </w:t>
+      </w:r>
+      <w:r>
+        <w:t>175x, 6 = 1</w:t>
+      </w:r>
+      <w:r>
+        <w:rPr>
+          <w:rFonts w:ascii="Arial" w:hAnsi="Arial" w:cs="Arial"/>
+        </w:rPr>
+        <w:t> </w:t>
+      </w:r>
+      <w:r>
+        <w:t>128x.</w:t>
+      </w:r>
+    </w:p>
+    <w:p>
+      <w:pPr>
+        <w:numPr>
+          <w:ilvl w:val="0"/>
+          <w:numId w:val="14"/>
+        </w:numPr>
+      </w:pPr>
+      <w:r>
+        <w:t>recommendation_metrics_no2_index: Postupně klesající frekvence od 1 (488</w:t>
+      </w:r>
+      <w:r>
+        <w:rPr>
+          <w:rFonts w:ascii="Arial" w:hAnsi="Arial" w:cs="Arial"/>
+        </w:rPr>
+        <w:t> </w:t>
+      </w:r>
+      <w:r>
+        <w:t>858x) a</w:t>
+      </w:r>
+      <w:r>
+        <w:rPr>
+          <w:rFonts w:ascii="Aptos" w:hAnsi="Aptos" w:cs="Aptos"/>
+        </w:rPr>
+        <w:t>ž</w:t>
+      </w:r>
+      <w:r>
+        <w:t xml:space="preserve"> po 6 (17x).</w:t>
+      </w:r>
+    </w:p>
+    <w:p>
+      <w:r>
+        <w:t xml:space="preserve">Proměnné recommendation_metrics_so2_index, co_index a o3_index mají vždy hodnotu </w:t>
+      </w:r>
+      <w:r>
+        <w:rPr>
+          <w:b/>
+          <w:bCs/>
+        </w:rPr>
+        <w:t>1</w:t>
+      </w:r>
+      <w:r>
+        <w:t>, tedy konstantní – nebudou využity v analýze.</w:t>
+      </w:r>
+    </w:p>
+    <w:p/>
+    <w:p>
+      <w:pPr>
+        <w:pStyle w:val="Nadpis3"/>
+      </w:pPr>
+      <w:r>
+        <w:t>Počasí</w:t>
+      </w:r>
+    </w:p>
+    <w:p>
+      <w:r>
+        <w:t>Dataset obsahuje 53</w:t>
+      </w:r>
+      <w:r>
+        <w:rPr>
+          <w:rFonts w:ascii="Arial" w:hAnsi="Arial" w:cs="Arial"/>
+        </w:rPr>
+        <w:t> </w:t>
+      </w:r>
+      <w:r>
+        <w:t>987 z</w:t>
+      </w:r>
+      <w:r>
+        <w:rPr>
+          <w:rFonts w:ascii="Aptos" w:hAnsi="Aptos" w:cs="Aptos"/>
+        </w:rPr>
+        <w:t>á</w:t>
+      </w:r>
+      <w:r>
+        <w:t>znam</w:t>
+      </w:r>
+      <w:r>
+        <w:rPr>
+          <w:rFonts w:ascii="Aptos" w:hAnsi="Aptos" w:cs="Aptos"/>
+        </w:rPr>
+        <w:t>ů</w:t>
+      </w:r>
+      <w:r>
+        <w:t xml:space="preserve"> z jednoho meteorologického senzoru. Pokrývá období od 3. 1. 2024 do 7. 2. 2025 (celkem 401 dní). Denní počet měření se pohybuje od 65 do 236.</w:t>
+      </w:r>
+    </w:p>
+    <w:p>
+      <w:r>
+        <w:t>Všechna měření obsahují údaje o teplotě, vlhkosti, tlaku, větru a srážkách. Proměnná data_leafWetness obsahuje pouze hodnotu NA a nebude dále analyzována.</w:t>
+      </w:r>
+    </w:p>
+    <w:p>
+      <w:r>
+        <w:t>Klíčové proměnné:</w:t>
+      </w:r>
+    </w:p>
+    <w:p>
+      <w:r>
+        <w:t>data_temp1 – teplota vzduchu (°C, min: −13,3; max: 38,5),</w:t>
+      </w:r>
+    </w:p>
+    <w:p>
+      <w:r>
+        <w:t>data_hum1 – relativní vlhkost (%, průměr: 81,1),</w:t>
+      </w:r>
+    </w:p>
+    <w:p>
+      <w:r>
+        <w:t>data_pressure – tlak (hPa, průměr: 97</w:t>
+      </w:r>
+      <w:r>
+        <w:rPr>
+          <w:rFonts w:ascii="Arial" w:hAnsi="Arial" w:cs="Arial"/>
+        </w:rPr>
+        <w:t> </w:t>
+      </w:r>
+      <w:r>
+        <w:t>562),</w:t>
+      </w:r>
+    </w:p>
+    <w:p>
+      <w:r>
+        <w:t>data_windSpeed – rychlost větru (m/s, průměr: 2,54),</w:t>
+      </w:r>
+    </w:p>
+    <w:p>
+      <w:r>
+        <w:t>data_windImpact – síla větru (kombinace rychlosti a směru),</w:t>
+      </w:r>
+    </w:p>
+    <w:p>
+      <w:r>
+        <w:t>data_volumeMm – srážky (mm, většina záznamů bez srážek),</w:t>
+      </w:r>
+    </w:p>
+    <w:p>
+      <w:r>
+        <w:t>data_windDir – směr větru jako kategorie (např. „E“, „S“, „SW“, nebo „err“ pro chybný záznam).</w:t>
+      </w:r>
+    </w:p>
+    <w:p/>
+    <w:p>
+      <w:pPr>
+        <w:pStyle w:val="Nadpis3"/>
+      </w:pPr>
+      <w:r>
+        <w:lastRenderedPageBreak/>
+        <w:t>Auta</w:t>
+      </w:r>
+    </w:p>
+    <w:p>
+      <w:r>
+        <w:t xml:space="preserve">Dataset obsahuje </w:t>
+      </w:r>
+      <w:r>
+        <w:rPr>
+          <w:b/>
+          <w:bCs/>
+        </w:rPr>
+        <w:t>42</w:t>
+      </w:r>
+      <w:r>
+        <w:rPr>
+          <w:rFonts w:ascii="Arial" w:hAnsi="Arial" w:cs="Arial"/>
+          <w:b/>
+          <w:bCs/>
+        </w:rPr>
+        <w:t> </w:t>
+      </w:r>
+      <w:r>
+        <w:rPr>
+          <w:b/>
+          <w:bCs/>
+        </w:rPr>
+        <w:t>417</w:t>
+      </w:r>
+      <w:r>
+        <w:rPr>
+          <w:rFonts w:ascii="Arial" w:hAnsi="Arial" w:cs="Arial"/>
+          <w:b/>
+          <w:bCs/>
+        </w:rPr>
+        <w:t> </w:t>
+      </w:r>
+      <w:r>
+        <w:rPr>
+          <w:b/>
+          <w:bCs/>
+        </w:rPr>
+        <w:t>146 z</w:t>
+      </w:r>
+      <w:r>
+        <w:rPr>
+          <w:rFonts w:ascii="Aptos" w:hAnsi="Aptos" w:cs="Aptos"/>
+          <w:b/>
+          <w:bCs/>
+        </w:rPr>
+        <w:t>á</w:t>
+      </w:r>
+      <w:r>
+        <w:rPr>
+          <w:b/>
+          <w:bCs/>
+        </w:rPr>
+        <w:t>znam</w:t>
+      </w:r>
+      <w:r>
+        <w:rPr>
+          <w:rFonts w:ascii="Aptos" w:hAnsi="Aptos" w:cs="Aptos"/>
+          <w:b/>
+          <w:bCs/>
+        </w:rPr>
+        <w:t>ů</w:t>
+      </w:r>
+      <w:r>
+        <w:t xml:space="preserve"> o jednotlivých průjezdech vozidel. Každý řádek odpovídá jednomu záznamu z radarového senzoru, včetně času průjezdu, místa měření a rychlosti.</w:t>
+      </w:r>
+    </w:p>
+    <w:p>
+      <w:pPr>
+        <w:rPr>
+          <w:b/>
+          <w:bCs/>
+        </w:rPr>
+      </w:pPr>
+      <w:r>
+        <w:rPr>
+          <w:b/>
+          <w:bCs/>
+        </w:rPr>
+        <w:t>Klíčové proměnné:</w:t>
+      </w:r>
+    </w:p>
+    <w:p>
+      <w:pPr>
+        <w:numPr>
+          <w:ilvl w:val="0"/>
+          <w:numId w:val="15"/>
+        </w:numPr>
+      </w:pPr>
+      <w:r>
+        <w:t>X_time – čas měření (ve formátu s časovým pásmem, bude převedeno na POSIXct),</w:t>
+      </w:r>
+    </w:p>
+    <w:p>
+      <w:pPr>
+        <w:numPr>
+          <w:ilvl w:val="0"/>
+          <w:numId w:val="15"/>
+        </w:numPr>
+      </w:pPr>
+      <w:r>
+        <w:t>country – stát původu vozidla (např. „CZ“, „unknown“),</w:t>
+      </w:r>
+    </w:p>
+    <w:p>
+      <w:pPr>
+        <w:numPr>
+          <w:ilvl w:val="0"/>
+          <w:numId w:val="15"/>
+        </w:numPr>
+      </w:pPr>
+      <w:r>
+        <w:t>sensor – identifikátor radaru,</w:t>
+      </w:r>
+    </w:p>
+    <w:p>
+      <w:pPr>
+        <w:numPr>
+          <w:ilvl w:val="0"/>
+          <w:numId w:val="15"/>
+        </w:numPr>
+      </w:pPr>
+      <w:r>
+        <w:t>type – typ vozidla (číslo 0–6),</w:t>
+      </w:r>
+    </w:p>
+    <w:p>
+      <w:pPr>
+        <w:numPr>
+          <w:ilvl w:val="0"/>
+          <w:numId w:val="15"/>
+        </w:numPr>
+      </w:pPr>
+      <w:r>
+        <w:t>speed – rychlost v km/h.</w:t>
+      </w:r>
+    </w:p>
+    <w:p>
+      <w:pPr>
+        <w:rPr>
+          <w:b/>
+          <w:bCs/>
+        </w:rPr>
+      </w:pPr>
+      <w:r>
+        <w:rPr>
+          <w:b/>
+          <w:bCs/>
+        </w:rPr>
+        <w:t>Rychlost vozidel (speed)</w:t>
+      </w:r>
+    </w:p>
+    <w:p>
+      <w:pPr>
+        <w:numPr>
+          <w:ilvl w:val="0"/>
+          <w:numId w:val="16"/>
+        </w:numPr>
+      </w:pPr>
+      <w:r>
+        <w:t>Hodnota -1 označuje chybná nebo neplatná měření (např. z koncového radaru).</w:t>
+      </w:r>
+      <w:r>
+        <w:br/>
+        <w:t>→ Vyskytuje se u 27</w:t>
+      </w:r>
+      <w:r>
+        <w:rPr>
+          <w:rFonts w:ascii="Arial" w:hAnsi="Arial" w:cs="Arial"/>
+        </w:rPr>
+        <w:t> </w:t>
+      </w:r>
+      <w:r>
+        <w:t>112</w:t>
+      </w:r>
+      <w:r>
+        <w:rPr>
+          <w:rFonts w:ascii="Arial" w:hAnsi="Arial" w:cs="Arial"/>
+        </w:rPr>
+        <w:t> </w:t>
+      </w:r>
+      <w:r>
+        <w:t>775 z</w:t>
+      </w:r>
+      <w:r>
+        <w:rPr>
+          <w:rFonts w:ascii="Aptos" w:hAnsi="Aptos" w:cs="Aptos"/>
+        </w:rPr>
+        <w:t>á</w:t>
+      </w:r>
+      <w:r>
+        <w:t>znam</w:t>
+      </w:r>
+      <w:r>
+        <w:rPr>
+          <w:rFonts w:ascii="Aptos" w:hAnsi="Aptos" w:cs="Aptos"/>
+        </w:rPr>
+        <w:t>ů</w:t>
+      </w:r>
+      <w:r>
+        <w:t xml:space="preserve"> (63,9 % všech dat).</w:t>
+      </w:r>
+    </w:p>
+    <w:p>
+      <w:pPr>
+        <w:numPr>
+          <w:ilvl w:val="0"/>
+          <w:numId w:val="16"/>
+        </w:numPr>
+      </w:pPr>
+      <w:r>
+        <w:t>Hodnota 0 je u 2</w:t>
+      </w:r>
+      <w:r>
+        <w:rPr>
+          <w:rFonts w:ascii="Arial" w:hAnsi="Arial" w:cs="Arial"/>
+        </w:rPr>
+        <w:t> </w:t>
+      </w:r>
+      <w:r>
+        <w:t>106</w:t>
+      </w:r>
+      <w:r>
+        <w:rPr>
+          <w:rFonts w:ascii="Arial" w:hAnsi="Arial" w:cs="Arial"/>
+        </w:rPr>
+        <w:t> </w:t>
+      </w:r>
+      <w:r>
+        <w:t>217 z</w:t>
+      </w:r>
+      <w:r>
+        <w:rPr>
+          <w:rFonts w:ascii="Aptos" w:hAnsi="Aptos" w:cs="Aptos"/>
+        </w:rPr>
+        <w:t>á</w:t>
+      </w:r>
+      <w:r>
+        <w:t>znam</w:t>
+      </w:r>
+      <w:r>
+        <w:rPr>
+          <w:rFonts w:ascii="Aptos" w:hAnsi="Aptos" w:cs="Aptos"/>
+        </w:rPr>
+        <w:t>ů</w:t>
+      </w:r>
+      <w:r>
+        <w:t xml:space="preserve"> (4,97 %) – může znamenat stojící vozidla nebo také chybu.</w:t>
+      </w:r>
+    </w:p>
+    <w:p>
+      <w:pPr>
+        <w:numPr>
+          <w:ilvl w:val="0"/>
+          <w:numId w:val="16"/>
+        </w:numPr>
+      </w:pPr>
+      <w:r>
+        <w:t>Zbývajících cca 31 % jsou běžné rychlosti 1–172 km/h.</w:t>
+      </w:r>
+    </w:p>
+    <w:p>
+      <w:pPr>
+        <w:numPr>
+          <w:ilvl w:val="0"/>
+          <w:numId w:val="16"/>
+        </w:numPr>
+      </w:pPr>
+      <w:r>
+        <w:t>Nejčastěji se vyskytují rychlosti mezi 45 a 70 km/h, přičemž maximum je 172 km/h.</w:t>
+      </w:r>
+    </w:p>
+    <w:p>
+      <w:r>
+        <w:t xml:space="preserve">Po odstranění chybných a nerelevantních měření (speed == -1 a speed == 0) zůstalo v datasetu </w:t>
+      </w:r>
+      <w:r>
+        <w:rPr>
+          <w:b/>
+          <w:bCs/>
+        </w:rPr>
+        <w:t>13</w:t>
+      </w:r>
+      <w:r>
+        <w:rPr>
+          <w:rFonts w:ascii="Arial" w:hAnsi="Arial" w:cs="Arial"/>
+          <w:b/>
+          <w:bCs/>
+        </w:rPr>
+        <w:t> </w:t>
+      </w:r>
+      <w:r>
+        <w:rPr>
+          <w:b/>
+          <w:bCs/>
+        </w:rPr>
+        <w:t>198</w:t>
+      </w:r>
+      <w:r>
+        <w:rPr>
+          <w:rFonts w:ascii="Arial" w:hAnsi="Arial" w:cs="Arial"/>
+          <w:b/>
+          <w:bCs/>
+        </w:rPr>
+        <w:t> </w:t>
+      </w:r>
+      <w:r>
+        <w:rPr>
+          <w:b/>
+          <w:bCs/>
+        </w:rPr>
+        <w:t>154 z</w:t>
+      </w:r>
+      <w:r>
+        <w:rPr>
+          <w:rFonts w:ascii="Aptos" w:hAnsi="Aptos" w:cs="Aptos"/>
+          <w:b/>
+          <w:bCs/>
+        </w:rPr>
+        <w:t>á</w:t>
+      </w:r>
+      <w:r>
+        <w:rPr>
+          <w:b/>
+          <w:bCs/>
+        </w:rPr>
+        <w:t>znam</w:t>
+      </w:r>
+      <w:r>
+        <w:rPr>
+          <w:rFonts w:ascii="Aptos" w:hAnsi="Aptos" w:cs="Aptos"/>
+          <w:b/>
+          <w:bCs/>
+        </w:rPr>
+        <w:t>ů</w:t>
+      </w:r>
+      <w:r>
+        <w:t xml:space="preserve">, což odpovídá přibližně </w:t>
+      </w:r>
+      <w:r>
+        <w:rPr>
+          <w:b/>
+          <w:bCs/>
+        </w:rPr>
+        <w:t>31 % původních dat</w:t>
+      </w:r>
+      <w:r>
+        <w:t>.</w:t>
+      </w:r>
+    </w:p>
+    <w:p>
+      <w:r>
+        <w:t>Změny ve statistice proměnné speed:</w:t>
+      </w:r>
+    </w:p>
+    <w:p>
+      <w:pPr>
+        <w:numPr>
+          <w:ilvl w:val="0"/>
+          <w:numId w:val="18"/>
+        </w:numPr>
+      </w:pPr>
+      <w:r>
+        <w:t xml:space="preserve">Minimum se posunulo na </w:t>
+      </w:r>
+      <w:r>
+        <w:rPr>
+          <w:b/>
+          <w:bCs/>
+        </w:rPr>
+        <w:t>1 km/h</w:t>
+      </w:r>
+      <w:r>
+        <w:t xml:space="preserve"> (původně −1),</w:t>
+      </w:r>
+    </w:p>
+    <w:p>
+      <w:pPr>
+        <w:numPr>
+          <w:ilvl w:val="0"/>
+          <w:numId w:val="18"/>
+        </w:numPr>
+      </w:pPr>
+      <w:r>
+        <w:t xml:space="preserve">Průměrná rychlost vzrostla z původních </w:t>
+      </w:r>
+      <w:r>
+        <w:rPr>
+          <w:b/>
+          <w:bCs/>
+        </w:rPr>
+        <w:t>17,17 km/h</w:t>
+      </w:r>
+      <w:r>
+        <w:t xml:space="preserve"> na </w:t>
+      </w:r>
+      <w:r>
+        <w:rPr>
+          <w:b/>
+          <w:bCs/>
+        </w:rPr>
+        <w:t>57,25 km/h</w:t>
+      </w:r>
+      <w:r>
+        <w:t>,</w:t>
+      </w:r>
+    </w:p>
+    <w:p>
+      <w:pPr>
+        <w:numPr>
+          <w:ilvl w:val="0"/>
+          <w:numId w:val="18"/>
+        </w:numPr>
+      </w:pPr>
+      <w:r>
+        <w:t xml:space="preserve">Medián se zvýšil na </w:t>
+      </w:r>
+      <w:r>
+        <w:rPr>
+          <w:b/>
+          <w:bCs/>
+        </w:rPr>
+        <w:t>59 km/h</w:t>
+      </w:r>
+      <w:r>
+        <w:t>, což odpovídá běžné městské rychlosti,</w:t>
+      </w:r>
+    </w:p>
+    <w:p>
+      <w:pPr>
+        <w:numPr>
+          <w:ilvl w:val="0"/>
+          <w:numId w:val="18"/>
+        </w:numPr>
+      </w:pPr>
+      <w:r>
+        <w:t>Hodnoty type nyní více odpovídají reálným průjezdům – typ 0 zůstává nejčastější, ale průměr vzrostl mírně nad 0.</w:t>
+      </w:r>
+    </w:p>
+    <w:p>
+      <w:r>
+        <w:t>Toto čištění výrazně zpřesnilo popis dat a umožní analýzu skutečných jízdních rychlostí bez zkreslení chybami měření.</w:t>
+      </w:r>
+    </w:p>
+    <w:p/>
+    <w:p>
+      <w:pPr>
+        <w:rPr>
+          <w:rFonts w:asciiTheme="majorHAnsi" w:hAnsiTheme="majorHAnsi"/>
+          <w:sz w:val="32"/>
+          <w:szCs w:val="32"/>
+        </w:rPr>
+      </w:pPr>
+      <w:r>
+        <w:br w:type="page"/>
+      </w:r>
+    </w:p>
+    <w:p>
+      <w:pPr>
         <w:pStyle w:val="Nadpis2"/>
       </w:pPr>
       <w:r>
+        <w:lastRenderedPageBreak/>
         <w:t>Typy proměnných</w:t>
       </w:r>
     </w:p>
     <w:p>
       <w:pPr>
+        <w:pStyle w:val="Nadpis3"/>
+      </w:pPr>
+      <w:r>
+        <w:t>Ovzduší</w:t>
+      </w:r>
+    </w:p>
+    <w:tbl>
+      <w:tblPr>
+        <w:tblW w:w="9154" w:type="dxa"/>
+        <w:tblLook w:val="04A0" w:firstRow="1" w:lastRow="0" w:firstColumn="1" w:lastColumn="0" w:noHBand="0" w:noVBand="1"/>
+      </w:tblPr>
+      <w:tblGrid>
+        <w:gridCol w:w="4530"/>
+        <w:gridCol w:w="2817"/>
+        <w:gridCol w:w="1807"/>
+      </w:tblGrid>
+      <w:tr>
+        <w:tc>
+          <w:tcPr>
+            <w:tcW w:w="4530" w:type="dxa"/>
+          </w:tcPr>
+          <w:p>
+            <w:r>
+              <w:t>Proměnná</w:t>
+            </w:r>
+          </w:p>
+        </w:tc>
+        <w:tc>
+          <w:tcPr>
+            <w:tcW w:w="2817" w:type="dxa"/>
+          </w:tcPr>
+          <w:p>
+            <w:r>
+              <w:t>Jednotka</w:t>
+            </w:r>
+          </w:p>
+        </w:tc>
+        <w:tc>
+          <w:tcPr>
+            <w:tcW w:w="1807" w:type="dxa"/>
+          </w:tcPr>
+          <w:p>
+            <w:r>
+              <w:t>Typ</w:t>
+            </w:r>
+          </w:p>
+        </w:tc>
+      </w:tr>
+      <w:tr>
+        <w:tc>
+          <w:tcPr>
+            <w:tcW w:w="4530" w:type="dxa"/>
+          </w:tcPr>
+          <w:p>
+            <w:r>
+              <w:t>id</w:t>
+            </w:r>
+          </w:p>
+        </w:tc>
+        <w:tc>
+          <w:tcPr>
+            <w:tcW w:w="2817" w:type="dxa"/>
+          </w:tcPr>
+          <w:p>
+            <w:r>
+              <w:t>-</w:t>
+            </w:r>
+          </w:p>
+        </w:tc>
+        <w:tc>
+          <w:tcPr>
+            <w:tcW w:w="1807" w:type="dxa"/>
+          </w:tcPr>
+          <w:p>
+            <w:r>
+              <w:t>character (identifikátor měření)</w:t>
+            </w:r>
+          </w:p>
+        </w:tc>
+      </w:tr>
+      <w:tr>
+        <w:tc>
+          <w:tcPr>
+            <w:tcW w:w="4530" w:type="dxa"/>
+          </w:tcPr>
+          <w:p>
+            <w:r>
+              <w:t>date</w:t>
+            </w:r>
+          </w:p>
+        </w:tc>
+        <w:tc>
+          <w:tcPr>
+            <w:tcW w:w="2817" w:type="dxa"/>
+          </w:tcPr>
+          <w:p>
+            <w:r>
+              <w:t>-</w:t>
+            </w:r>
+          </w:p>
+        </w:tc>
+        <w:tc>
+          <w:tcPr>
+            <w:tcW w:w="1807" w:type="dxa"/>
+          </w:tcPr>
+          <w:p>
+            <w:r>
+              <w:t>character (časový údaj, bude převeden na POSIXct)</w:t>
+            </w:r>
+          </w:p>
+        </w:tc>
+      </w:tr>
+      <w:tr>
+        <w:tc>
+          <w:tcPr>
+            <w:tcW w:w="4530" w:type="dxa"/>
+          </w:tcPr>
+          <w:p>
+            <w:r>
+              <w:t>sensor_id</w:t>
+            </w:r>
+          </w:p>
+        </w:tc>
+        <w:tc>
+          <w:tcPr>
+            <w:tcW w:w="2817" w:type="dxa"/>
+          </w:tcPr>
+          <w:p>
+            <w:r>
+              <w:t>-</w:t>
+            </w:r>
+          </w:p>
+        </w:tc>
+        <w:tc>
+          <w:tcPr>
+            <w:tcW w:w="1807" w:type="dxa"/>
+          </w:tcPr>
+          <w:p>
+            <w:r>
+              <w:t>integer (ID senzoru)</w:t>
+            </w:r>
+          </w:p>
+        </w:tc>
+      </w:tr>
+      <w:tr>
+        <w:tc>
+          <w:tcPr>
+            <w:tcW w:w="4530" w:type="dxa"/>
+          </w:tcPr>
+          <w:p>
+            <w:r>
+              <w:t>data_pm10</w:t>
+            </w:r>
+          </w:p>
+        </w:tc>
+        <w:tc>
+          <w:tcPr>
+            <w:tcW w:w="2817" w:type="dxa"/>
+          </w:tcPr>
+          <w:p>
+            <w:r>
+              <w:t>µg/m³</w:t>
+            </w:r>
+          </w:p>
+        </w:tc>
+        <w:tc>
+          <w:tcPr>
+            <w:tcW w:w="1807" w:type="dxa"/>
+          </w:tcPr>
+          <w:p>
+            <w:r>
+              <w:t>numeric (spojitá)</w:t>
+            </w:r>
+          </w:p>
+        </w:tc>
+      </w:tr>
+      <w:tr>
+        <w:tc>
+          <w:tcPr>
+            <w:tcW w:w="4530" w:type="dxa"/>
+          </w:tcPr>
+          <w:p>
+            <w:r>
+              <w:t>data_pm25</w:t>
+            </w:r>
+          </w:p>
+        </w:tc>
+        <w:tc>
+          <w:tcPr>
+            <w:tcW w:w="2817" w:type="dxa"/>
+          </w:tcPr>
+          <w:p>
+            <w:r>
+              <w:t>µg/m³</w:t>
+            </w:r>
+          </w:p>
+        </w:tc>
+        <w:tc>
+          <w:tcPr>
+            <w:tcW w:w="1807" w:type="dxa"/>
+          </w:tcPr>
+          <w:p>
+            <w:r>
+              <w:t>numeric (spojitá)</w:t>
+            </w:r>
+          </w:p>
+        </w:tc>
+      </w:tr>
+      <w:tr>
+        <w:tc>
+          <w:tcPr>
+            <w:tcW w:w="4530" w:type="dxa"/>
+          </w:tcPr>
+          <w:p>
+            <w:r>
+              <w:t>data_pm40</w:t>
+            </w:r>
+          </w:p>
+        </w:tc>
+        <w:tc>
+          <w:tcPr>
+            <w:tcW w:w="2817" w:type="dxa"/>
+          </w:tcPr>
+          <w:p>
+            <w:r>
+              <w:t>µg/m³</w:t>
+            </w:r>
+          </w:p>
+        </w:tc>
+        <w:tc>
+          <w:tcPr>
+            <w:tcW w:w="1807" w:type="dxa"/>
+          </w:tcPr>
+          <w:p>
+            <w:r>
+              <w:t>numeric (spojitá)</w:t>
+            </w:r>
+          </w:p>
+        </w:tc>
+      </w:tr>
+      <w:tr>
+        <w:tc>
+          <w:tcPr>
+            <w:tcW w:w="4530" w:type="dxa"/>
+          </w:tcPr>
+          <w:p>
+            <w:r>
+              <w:t>data_pm100</w:t>
+            </w:r>
+          </w:p>
+        </w:tc>
+        <w:tc>
+          <w:tcPr>
+            <w:tcW w:w="2817" w:type="dxa"/>
+          </w:tcPr>
+          <w:p>
+            <w:r>
+              <w:t>µg/m³</w:t>
+            </w:r>
+          </w:p>
+        </w:tc>
+        <w:tc>
+          <w:tcPr>
+            <w:tcW w:w="1807" w:type="dxa"/>
+          </w:tcPr>
+          <w:p>
+            <w:r>
+              <w:t>numeric (spojitá)</w:t>
+            </w:r>
+          </w:p>
+        </w:tc>
+      </w:tr>
+      <w:tr>
+        <w:tc>
+          <w:tcPr>
+            <w:tcW w:w="4530" w:type="dxa"/>
+          </w:tcPr>
+          <w:p>
+            <w:r>
+              <w:t>data_o3</w:t>
+            </w:r>
+          </w:p>
+        </w:tc>
+        <w:tc>
+          <w:tcPr>
+            <w:tcW w:w="2817" w:type="dxa"/>
+          </w:tcPr>
+          <w:p>
+            <w:r>
+              <w:t>µg/m³</w:t>
+            </w:r>
+          </w:p>
+        </w:tc>
+        <w:tc>
+          <w:tcPr>
+            <w:tcW w:w="1807" w:type="dxa"/>
+          </w:tcPr>
+          <w:p>
+            <w:r>
+              <w:t>logical (všude NA)</w:t>
+            </w:r>
+          </w:p>
+        </w:tc>
+      </w:tr>
+      <w:tr>
+        <w:tc>
+          <w:tcPr>
+            <w:tcW w:w="4530" w:type="dxa"/>
+          </w:tcPr>
+          <w:p>
+            <w:r>
+              <w:t>data_co</w:t>
+            </w:r>
+          </w:p>
+        </w:tc>
+        <w:tc>
+          <w:tcPr>
+            <w:tcW w:w="2817" w:type="dxa"/>
+          </w:tcPr>
+          <w:p>
+            <w:r>
+              <w:t>µg/m³</w:t>
+            </w:r>
+          </w:p>
+        </w:tc>
+        <w:tc>
+          <w:tcPr>
+            <w:tcW w:w="1807" w:type="dxa"/>
+          </w:tcPr>
+          <w:p>
+            <w:r>
+              <w:t>logical (všude NA)</w:t>
+            </w:r>
+          </w:p>
+        </w:tc>
+      </w:tr>
+      <w:tr>
+        <w:tc>
+          <w:tcPr>
+            <w:tcW w:w="4530" w:type="dxa"/>
+          </w:tcPr>
+          <w:p>
+            <w:r>
+              <w:t>data_no2</w:t>
+            </w:r>
+          </w:p>
+        </w:tc>
+        <w:tc>
+          <w:tcPr>
+            <w:tcW w:w="2817" w:type="dxa"/>
+          </w:tcPr>
+          <w:p>
+            <w:r>
+              <w:t>µg/m³</w:t>
+            </w:r>
+          </w:p>
+        </w:tc>
+        <w:tc>
+          <w:tcPr>
+            <w:tcW w:w="1807" w:type="dxa"/>
+          </w:tcPr>
+          <w:p>
+            <w:r>
+              <w:t>numeric (spojitá, ~50 % záznamů NA)</w:t>
+            </w:r>
+          </w:p>
+        </w:tc>
+      </w:tr>
+      <w:tr>
+        <w:tc>
+          <w:tcPr>
+            <w:tcW w:w="4530" w:type="dxa"/>
+          </w:tcPr>
+          <w:p>
+            <w:r>
+              <w:t>data_so2</w:t>
+            </w:r>
+          </w:p>
+        </w:tc>
+        <w:tc>
+          <w:tcPr>
+            <w:tcW w:w="2817" w:type="dxa"/>
+          </w:tcPr>
+          <w:p>
+            <w:r>
+              <w:t>µg/m³</w:t>
+            </w:r>
+          </w:p>
+        </w:tc>
+        <w:tc>
+          <w:tcPr>
+            <w:tcW w:w="1807" w:type="dxa"/>
+          </w:tcPr>
+          <w:p>
+            <w:r>
+              <w:t>logical (všude NA)</w:t>
+            </w:r>
+          </w:p>
+        </w:tc>
+      </w:tr>
+      <w:tr>
+        <w:tc>
+          <w:tcPr>
+            <w:tcW w:w="4530" w:type="dxa"/>
+          </w:tcPr>
+          <w:p>
+            <w:r>
+              <w:t>recommendation_index</w:t>
+            </w:r>
+          </w:p>
+        </w:tc>
+        <w:tc>
+          <w:tcPr>
+            <w:tcW w:w="2817" w:type="dxa"/>
+          </w:tcPr>
+          <w:p>
+            <w:r>
+              <w:t>-</w:t>
+            </w:r>
+          </w:p>
+        </w:tc>
+        <w:tc>
+          <w:tcPr>
+            <w:tcW w:w="1807" w:type="dxa"/>
+          </w:tcPr>
+          <w:p>
+            <w:r>
+              <w:t>integer (1–6, ordinalní)</w:t>
+            </w:r>
+          </w:p>
+        </w:tc>
+      </w:tr>
+      <w:tr>
+        <w:tc>
+          <w:tcPr>
+            <w:tcW w:w="4530" w:type="dxa"/>
+          </w:tcPr>
+          <w:p>
+            <w:r>
+              <w:t>recommendation_metrics_so2_index</w:t>
+            </w:r>
+          </w:p>
+        </w:tc>
+        <w:tc>
+          <w:tcPr>
+            <w:tcW w:w="2817" w:type="dxa"/>
+          </w:tcPr>
+          <w:p>
+            <w:r>
+              <w:t>-</w:t>
+            </w:r>
+          </w:p>
+        </w:tc>
+        <w:tc>
+          <w:tcPr>
+            <w:tcW w:w="1807" w:type="dxa"/>
+          </w:tcPr>
+          <w:p>
+            <w:r>
+              <w:t>integer (1–6, ordinalní)</w:t>
+            </w:r>
+          </w:p>
+        </w:tc>
+      </w:tr>
+      <w:tr>
+        <w:tc>
+          <w:tcPr>
+            <w:tcW w:w="4530" w:type="dxa"/>
+          </w:tcPr>
+          <w:p>
+            <w:r>
+              <w:lastRenderedPageBreak/>
+              <w:t>recommendation_metrics_no2_index</w:t>
+            </w:r>
+          </w:p>
+        </w:tc>
+        <w:tc>
+          <w:tcPr>
+            <w:tcW w:w="2817" w:type="dxa"/>
+          </w:tcPr>
+          <w:p>
+            <w:r>
+              <w:t>-</w:t>
+            </w:r>
+          </w:p>
+        </w:tc>
+        <w:tc>
+          <w:tcPr>
+            <w:tcW w:w="1807" w:type="dxa"/>
+          </w:tcPr>
+          <w:p>
+            <w:r>
+              <w:t>integer (1–6, ordinalní)</w:t>
+            </w:r>
+          </w:p>
+        </w:tc>
+      </w:tr>
+      <w:tr>
+        <w:tc>
+          <w:tcPr>
+            <w:tcW w:w="4530" w:type="dxa"/>
+          </w:tcPr>
+          <w:p>
+            <w:r>
+              <w:t>recommendation_metrics_co_index</w:t>
+            </w:r>
+          </w:p>
+        </w:tc>
+        <w:tc>
+          <w:tcPr>
+            <w:tcW w:w="2817" w:type="dxa"/>
+          </w:tcPr>
+          <w:p>
+            <w:r>
+              <w:t>-</w:t>
+            </w:r>
+          </w:p>
+        </w:tc>
+        <w:tc>
+          <w:tcPr>
+            <w:tcW w:w="1807" w:type="dxa"/>
+          </w:tcPr>
+          <w:p>
+            <w:r>
+              <w:t>integer (1–6, ordinalní)</w:t>
+            </w:r>
+          </w:p>
+        </w:tc>
+      </w:tr>
+      <w:tr>
+        <w:tc>
+          <w:tcPr>
+            <w:tcW w:w="4530" w:type="dxa"/>
+          </w:tcPr>
+          <w:p>
+            <w:r>
+              <w:t>recommendation_metrics_o3_index</w:t>
+            </w:r>
+          </w:p>
+        </w:tc>
+        <w:tc>
+          <w:tcPr>
+            <w:tcW w:w="2817" w:type="dxa"/>
+          </w:tcPr>
+          <w:p>
+            <w:r>
+              <w:t>-</w:t>
+            </w:r>
+          </w:p>
+        </w:tc>
+        <w:tc>
+          <w:tcPr>
+            <w:tcW w:w="1807" w:type="dxa"/>
+          </w:tcPr>
+          <w:p>
+            <w:r>
+              <w:t>integer (1–6, ordinalní)</w:t>
+            </w:r>
+          </w:p>
+        </w:tc>
+      </w:tr>
+      <w:tr>
+        <w:tc>
+          <w:tcPr>
+            <w:tcW w:w="4530" w:type="dxa"/>
+          </w:tcPr>
+          <w:p>
+            <w:r>
+              <w:t>recommendation_metrics_pm100_index</w:t>
+            </w:r>
+          </w:p>
+        </w:tc>
+        <w:tc>
+          <w:tcPr>
+            <w:tcW w:w="2817" w:type="dxa"/>
+          </w:tcPr>
+          <w:p>
+            <w:r>
+              <w:t>-</w:t>
+            </w:r>
+          </w:p>
+        </w:tc>
+        <w:tc>
+          <w:tcPr>
+            <w:tcW w:w="1807" w:type="dxa"/>
+          </w:tcPr>
+          <w:p>
+            <w:r>
+              <w:t>integer (1–6, ordinalní)</w:t>
+            </w:r>
+          </w:p>
+        </w:tc>
+      </w:tr>
+      <w:tr>
+        <w:tc>
+          <w:tcPr>
+            <w:tcW w:w="4530" w:type="dxa"/>
+          </w:tcPr>
+          <w:p>
+            <w:r>
+              <w:t>recommendation_metrics_pm25_index</w:t>
+            </w:r>
+          </w:p>
+        </w:tc>
+        <w:tc>
+          <w:tcPr>
+            <w:tcW w:w="2817" w:type="dxa"/>
+          </w:tcPr>
+          <w:p>
+            <w:r>
+              <w:t>-</w:t>
+            </w:r>
+          </w:p>
+        </w:tc>
+        <w:tc>
+          <w:tcPr>
+            <w:tcW w:w="1807" w:type="dxa"/>
+          </w:tcPr>
+          <w:p>
+            <w:r>
+              <w:t>integer (1–6, ordinalní)</w:t>
+            </w:r>
+          </w:p>
+        </w:tc>
+      </w:tr>
+    </w:tbl>
+    <w:p>
+      <w:pPr>
+        <w:pStyle w:val="Nadpis3"/>
+      </w:pPr>
+      <w:r>
+        <w:t>Počasí</w:t>
+      </w:r>
+    </w:p>
+    <w:tbl>
+      <w:tblPr>
+        <w:tblW w:w="0" w:type="auto"/>
+        <w:tblLook w:val="04A0" w:firstRow="1" w:lastRow="0" w:firstColumn="1" w:lastColumn="0" w:noHBand="0" w:noVBand="1"/>
+      </w:tblPr>
+      <w:tblGrid>
+        <w:gridCol w:w="2880"/>
+        <w:gridCol w:w="2880"/>
+        <w:gridCol w:w="2880"/>
+      </w:tblGrid>
+      <w:tr>
+        <w:tc>
+          <w:tcPr>
+            <w:tcW w:w="2880" w:type="dxa"/>
+          </w:tcPr>
+          <w:p>
+            <w:r>
+              <w:t>Proměnná</w:t>
+            </w:r>
+          </w:p>
+        </w:tc>
+        <w:tc>
+          <w:tcPr>
+            <w:tcW w:w="2880" w:type="dxa"/>
+          </w:tcPr>
+          <w:p>
+            <w:r>
+              <w:t>Jednotka</w:t>
+            </w:r>
+          </w:p>
+        </w:tc>
+        <w:tc>
+          <w:tcPr>
+            <w:tcW w:w="2880" w:type="dxa"/>
+          </w:tcPr>
+          <w:p>
+            <w:r>
+              <w:t>Typ</w:t>
+            </w:r>
+          </w:p>
+        </w:tc>
+      </w:tr>
+      <w:tr>
+        <w:tc>
+          <w:tcPr>
+            <w:tcW w:w="2880" w:type="dxa"/>
+          </w:tcPr>
+          <w:p>
+            <w:r>
+              <w:t>id</w:t>
+            </w:r>
+          </w:p>
+        </w:tc>
+        <w:tc>
+          <w:tcPr>
+            <w:tcW w:w="2880" w:type="dxa"/>
+          </w:tcPr>
+          <w:p>
+            <w:r>
+              <w:t>-</w:t>
+            </w:r>
+          </w:p>
+        </w:tc>
+        <w:tc>
+          <w:tcPr>
+            <w:tcW w:w="2880" w:type="dxa"/>
+          </w:tcPr>
+          <w:p>
+            <w:r>
+              <w:t>character (identifikátor měření)</w:t>
+            </w:r>
+          </w:p>
+        </w:tc>
+      </w:tr>
+      <w:tr>
+        <w:tc>
+          <w:tcPr>
+            <w:tcW w:w="2880" w:type="dxa"/>
+          </w:tcPr>
+          <w:p>
+            <w:r>
+              <w:t>date</w:t>
+            </w:r>
+          </w:p>
+        </w:tc>
+        <w:tc>
+          <w:tcPr>
+            <w:tcW w:w="2880" w:type="dxa"/>
+          </w:tcPr>
+          <w:p>
+            <w:r>
+              <w:t>-</w:t>
+            </w:r>
+          </w:p>
+        </w:tc>
+        <w:tc>
+          <w:tcPr>
+            <w:tcW w:w="2880" w:type="dxa"/>
+          </w:tcPr>
+          <w:p>
+            <w:r>
+              <w:t>character (časový údaj, převede se na POSIXct)</w:t>
+            </w:r>
+          </w:p>
+        </w:tc>
+      </w:tr>
+      <w:tr>
+        <w:tc>
+          <w:tcPr>
+            <w:tcW w:w="2880" w:type="dxa"/>
+          </w:tcPr>
+          <w:p>
+            <w:r>
+              <w:t>sensor_id</w:t>
+            </w:r>
+          </w:p>
+        </w:tc>
+        <w:tc>
+          <w:tcPr>
+            <w:tcW w:w="2880" w:type="dxa"/>
+          </w:tcPr>
+          <w:p>
+            <w:r>
+              <w:t>-</w:t>
+            </w:r>
+          </w:p>
+        </w:tc>
+        <w:tc>
+          <w:tcPr>
+            <w:tcW w:w="2880" w:type="dxa"/>
+          </w:tcPr>
+          <w:p>
+            <w:r>
+              <w:t>integer (ID senzoru)</w:t>
+            </w:r>
+          </w:p>
+        </w:tc>
+      </w:tr>
+      <w:tr>
+        <w:tc>
+          <w:tcPr>
+            <w:tcW w:w="2880" w:type="dxa"/>
+          </w:tcPr>
+          <w:p>
+            <w:r>
+              <w:t>data_temp1</w:t>
+            </w:r>
+          </w:p>
+        </w:tc>
+        <w:tc>
+          <w:tcPr>
+            <w:tcW w:w="2880" w:type="dxa"/>
+          </w:tcPr>
+          <w:p>
+            <w:r>
+              <w:t>°C</w:t>
+            </w:r>
+          </w:p>
+        </w:tc>
+        <w:tc>
+          <w:tcPr>
+            <w:tcW w:w="2880" w:type="dxa"/>
+          </w:tcPr>
+          <w:p>
+            <w:r>
+              <w:t>numeric (spojitá, teplota vzduchu)</w:t>
+            </w:r>
+          </w:p>
+        </w:tc>
+      </w:tr>
+      <w:tr>
+        <w:tc>
+          <w:tcPr>
+            <w:tcW w:w="2880" w:type="dxa"/>
+          </w:tcPr>
+          <w:p>
+            <w:r>
+              <w:t>data_hum1</w:t>
+            </w:r>
+          </w:p>
+        </w:tc>
+        <w:tc>
+          <w:tcPr>
+            <w:tcW w:w="2880" w:type="dxa"/>
+          </w:tcPr>
+          <w:p>
+            <w:r>
+              <w:t>%</w:t>
+            </w:r>
+          </w:p>
+        </w:tc>
+        <w:tc>
+          <w:tcPr>
+            <w:tcW w:w="2880" w:type="dxa"/>
+          </w:tcPr>
+          <w:p>
+            <w:r>
+              <w:t>numeric (spojitá, relativní vlhkost)</w:t>
+            </w:r>
+          </w:p>
+        </w:tc>
+      </w:tr>
+      <w:tr>
+        <w:tc>
+          <w:tcPr>
+            <w:tcW w:w="2880" w:type="dxa"/>
+          </w:tcPr>
+          <w:p>
+            <w:r>
+              <w:t>data_pressure</w:t>
+            </w:r>
+          </w:p>
+        </w:tc>
+        <w:tc>
+          <w:tcPr>
+            <w:tcW w:w="2880" w:type="dxa"/>
+          </w:tcPr>
+          <w:p>
+            <w:r>
+              <w:t>Pa</w:t>
+            </w:r>
+          </w:p>
+        </w:tc>
+        <w:tc>
+          <w:tcPr>
+            <w:tcW w:w="2880" w:type="dxa"/>
+          </w:tcPr>
+          <w:p>
+            <w:r>
+              <w:t>numeric (spojitá, atmosférický tlak)</w:t>
+            </w:r>
+          </w:p>
+        </w:tc>
+      </w:tr>
+      <w:tr>
+        <w:tc>
+          <w:tcPr>
+            <w:tcW w:w="2880" w:type="dxa"/>
+          </w:tcPr>
+          <w:p>
+            <w:r>
+              <w:t>data_windDir</w:t>
+            </w:r>
+          </w:p>
+        </w:tc>
+        <w:tc>
+          <w:tcPr>
+            <w:tcW w:w="2880" w:type="dxa"/>
+          </w:tcPr>
+          <w:p>
+            <w:r>
+              <w:t>-</w:t>
+            </w:r>
+          </w:p>
+        </w:tc>
+        <w:tc>
+          <w:tcPr>
+            <w:tcW w:w="2880" w:type="dxa"/>
+          </w:tcPr>
+          <w:p>
+            <w:r>
+              <w:t>character (kategorická, směr větru)</w:t>
+            </w:r>
+          </w:p>
+        </w:tc>
+      </w:tr>
+      <w:tr>
+        <w:tc>
+          <w:tcPr>
+            <w:tcW w:w="2880" w:type="dxa"/>
+          </w:tcPr>
+          <w:p>
+            <w:r>
+              <w:t>data_windSpeed</w:t>
+            </w:r>
+          </w:p>
+        </w:tc>
+        <w:tc>
+          <w:tcPr>
+            <w:tcW w:w="2880" w:type="dxa"/>
+          </w:tcPr>
+          <w:p>
+            <w:r>
+              <w:t>m/s</w:t>
+            </w:r>
+          </w:p>
+        </w:tc>
+        <w:tc>
+          <w:tcPr>
+            <w:tcW w:w="2880" w:type="dxa"/>
+          </w:tcPr>
+          <w:p>
+            <w:r>
+              <w:t>numeric (spojitá, rychlost větru)</w:t>
+            </w:r>
+          </w:p>
+        </w:tc>
+      </w:tr>
+      <w:tr>
+        <w:tc>
+          <w:tcPr>
+            <w:tcW w:w="2880" w:type="dxa"/>
+          </w:tcPr>
+          <w:p>
+            <w:r>
+              <w:t>data_windImpact</w:t>
+            </w:r>
+          </w:p>
+        </w:tc>
+        <w:tc>
+          <w:tcPr>
+            <w:tcW w:w="2880" w:type="dxa"/>
+          </w:tcPr>
+          <w:p>
+            <w:r>
+              <w:t>-</w:t>
+            </w:r>
+          </w:p>
+        </w:tc>
+        <w:tc>
+          <w:tcPr>
+            <w:tcW w:w="2880" w:type="dxa"/>
+          </w:tcPr>
+          <w:p>
+            <w:r>
+              <w:t>numeric (spojitá, síla větru)</w:t>
+            </w:r>
+          </w:p>
+        </w:tc>
+      </w:tr>
+      <w:tr>
+        <w:tc>
+          <w:tcPr>
+            <w:tcW w:w="2880" w:type="dxa"/>
+          </w:tcPr>
+          <w:p>
+            <w:r>
+              <w:t>data_volumeMm</w:t>
+            </w:r>
+          </w:p>
+        </w:tc>
+        <w:tc>
+          <w:tcPr>
+            <w:tcW w:w="2880" w:type="dxa"/>
+          </w:tcPr>
+          <w:p>
+            <w:r>
+              <w:t>mm</w:t>
+            </w:r>
+          </w:p>
+        </w:tc>
+        <w:tc>
+          <w:tcPr>
+            <w:tcW w:w="2880" w:type="dxa"/>
+          </w:tcPr>
+          <w:p>
+            <w:r>
+              <w:t>numeric (spojitá, srážky za hodinu)</w:t>
+            </w:r>
+          </w:p>
+        </w:tc>
+      </w:tr>
+      <w:tr>
+        <w:tc>
+          <w:tcPr>
+            <w:tcW w:w="2880" w:type="dxa"/>
+          </w:tcPr>
+          <w:p>
+            <w:r>
+              <w:lastRenderedPageBreak/>
+              <w:t>data_leafWetness</w:t>
+            </w:r>
+          </w:p>
+        </w:tc>
+        <w:tc>
+          <w:tcPr>
+            <w:tcW w:w="2880" w:type="dxa"/>
+          </w:tcPr>
+          <w:p>
+            <w:r>
+              <w:t>-</w:t>
+            </w:r>
+          </w:p>
+        </w:tc>
+        <w:tc>
+          <w:tcPr>
+            <w:tcW w:w="2880" w:type="dxa"/>
+          </w:tcPr>
+          <w:p>
+            <w:r>
+              <w:t>logical (všude NA – nebude dále použito)</w:t>
+            </w:r>
+          </w:p>
+        </w:tc>
+      </w:tr>
+    </w:tbl>
+    <w:p>
+      <w:pPr>
+        <w:pStyle w:val="Nadpis3"/>
+        <w:rPr>
+          <w:rFonts w:asciiTheme="majorHAnsi" w:hAnsiTheme="majorHAnsi"/>
+          <w:sz w:val="32"/>
+          <w:szCs w:val="32"/>
+        </w:rPr>
+      </w:pPr>
+      <w:r>
+        <w:br w:type="page"/>
+      </w:r>
+    </w:p>
+    <w:p>
+      <w:pPr>
         <w:pStyle w:val="Nadpis2"/>
       </w:pPr>
       <w:r>
+        <w:lastRenderedPageBreak/>
         <w:t>Základní statistiky</w:t>
       </w:r>
     </w:p>
@@ -882,11 +3407,7 @@
       </w:r>
       <w:r>
         <w:br/>
-        <w:t xml:space="preserve">Průměrná koncentrace byla 14,83 µg/m³, medián 11,95 µg/m³. Maximum dosáhlo 2423 µg/m³, což může naznačovat výskyt odlehlých nebo extrémních </w:t>
-      </w:r>
-      <w:r>
-        <w:lastRenderedPageBreak/>
-        <w:t>hodnot. Rozložení má silnou pravostrannou šikmost (skewness = 35,81) a extrémně vysokou špičatost (kurtosis = 4303,50).</w:t>
+        <w:t>Průměrná koncentrace byla 14,83 µg/m³, medián 11,95 µg/m³. Maximum dosáhlo 2423 µg/m³, což může naznačovat výskyt odlehlých nebo extrémních hodnot. Rozložení má silnou pravostrannou šikmost (skewness = 35,81) a extrémně vysokou špičatost (kurtosis = 4303,50).</w:t>
       </w:r>
     </w:p>
     <w:p/>
@@ -1756,7 +4277,6 @@
         </w:numPr>
       </w:pPr>
       <w:r>
-        <w:lastRenderedPageBreak/>
         <w:t>Průměrná hodnota tlaku činí 97</w:t>
       </w:r>
       <w:r>
@@ -2015,6 +4535,7 @@
           <w:b/>
           <w:bCs/>
         </w:rPr>
+        <w:lastRenderedPageBreak/>
         <w:t>Rychlost větru (data_windSpeed)</w:t>
       </w:r>
     </w:p>
@@ -3602,15 +6123,7 @@
         <w:pStyle w:val="Nadpis3"/>
       </w:pPr>
       <w:r>
-        <w:t>Počasí (</w:t>
-      </w:r>
-      <w:proofErr w:type="spellStart"/>
-      <w:r>
-        <w:t>meteo</w:t>
-      </w:r>
-      <w:proofErr w:type="spellEnd"/>
-      <w:r>
-        <w:t>)</w:t>
+        <w:t>Počasí (meteo)</w:t>
       </w:r>
     </w:p>
     <w:p>
@@ -4719,15 +7232,7 @@
     </w:p>
     <w:p>
       <w:r>
-        <w:t xml:space="preserve">Problém s tím, že časový formát je zapsán v UTC čase a pro zkoumání závislostí na dopravě je důležité, aby provoz nebyl tímto ovlivněn – </w:t>
-      </w:r>
-      <w:proofErr w:type="spellStart"/>
-      <w:r>
-        <w:t>krejí</w:t>
-      </w:r>
-      <w:proofErr w:type="spellEnd"/>
-      <w:r>
-        <w:t xml:space="preserve"> se tak zimní a letní časy do jednoho, co způsobuje nesrovnalost, když chceme zobrazit průměry na hodiny.</w:t>
+        <w:t>Problém s tím, že časový formát je zapsán v UTC čase a pro zkoumání závislostí na dopravě je důležité, aby provoz nebyl tímto ovlivněn – krejí se tak zimní a letní časy do jednoho, co způsobuje nesrovnalost, když chceme zobrazit průměry na hodiny.</w:t>
       </w:r>
       <w:r>
         <w:br/>
@@ -4760,23 +7265,7 @@
         </w:numPr>
       </w:pPr>
       <w:r>
-        <w:t xml:space="preserve">Aplikováno pomocí knihovny </w:t>
-      </w:r>
-      <w:proofErr w:type="spellStart"/>
-      <w:r>
-        <w:t>lubridate</w:t>
-      </w:r>
-      <w:proofErr w:type="spellEnd"/>
-      <w:r>
-        <w:t xml:space="preserve">, kde je databáze časových pásem </w:t>
-      </w:r>
-      <w:proofErr w:type="spellStart"/>
-      <w:r>
-        <w:t>tzdata</w:t>
-      </w:r>
-      <w:proofErr w:type="spellEnd"/>
-      <w:r>
-        <w:t>, který zohlednil i pořadí hodnot</w:t>
+        <w:t>Aplikováno pomocí knihovny lubridate, kde je databáze časových pásem tzdata, který zohlednil i pořadí hodnot</w:t>
       </w:r>
     </w:p>
     <w:p>
@@ -4799,15 +7288,7 @@
         </w:numPr>
       </w:pPr>
       <w:r>
-        <w:t xml:space="preserve">Z grafů zobrazující </w:t>
-      </w:r>
-      <w:proofErr w:type="spellStart"/>
-      <w:r>
-        <w:t>boxploty</w:t>
-      </w:r>
-      <w:proofErr w:type="spellEnd"/>
-      <w:r>
-        <w:t xml:space="preserve"> podle měsíců, zobrazující průměrnou koncentraci PM10, bylo v červencovém měsíci změřeno velmi mnoho odlehlých hodnot</w:t>
+        <w:t>Z grafů zobrazující boxploty podle měsíců, zobrazující průměrnou koncentraci PM10, bylo v červencovém měsíci změřeno velmi mnoho odlehlých hodnot</w:t>
       </w:r>
     </w:p>
     <w:p>
@@ -4822,15 +7303,7 @@
         <w:t>Pr</w:t>
       </w:r>
       <w:r>
-        <w:t>oto aplikuji metodu „</w:t>
-      </w:r>
-      <w:proofErr w:type="spellStart"/>
-      <w:r>
-        <w:t>Winsorizace</w:t>
-      </w:r>
-      <w:proofErr w:type="spellEnd"/>
-      <w:r>
-        <w:t>“</w:t>
+        <w:t>oto aplikuji metodu „Winsorizace“</w:t>
       </w:r>
     </w:p>
     <w:p>
@@ -4855,15 +7328,7 @@
         </w:numPr>
       </w:pPr>
       <w:r>
-        <w:t xml:space="preserve">v našem případě aplikujeme jednostrannou </w:t>
-      </w:r>
-      <w:proofErr w:type="spellStart"/>
-      <w:r>
-        <w:t>winsorizaci</w:t>
-      </w:r>
-      <w:proofErr w:type="spellEnd"/>
-      <w:r>
-        <w:t xml:space="preserve"> </w:t>
+        <w:t xml:space="preserve">v našem případě aplikujeme jednostrannou winsorizaci </w:t>
       </w:r>
       <w:r>
         <w:t xml:space="preserve">u proměnné pm100 </w:t>
@@ -4881,15 +7346,7 @@
         </w:numPr>
       </w:pPr>
       <w:r>
-        <w:t xml:space="preserve">stejně aplikujeme jednostrannou </w:t>
-      </w:r>
-      <w:proofErr w:type="spellStart"/>
-      <w:r>
-        <w:t>winsorizaci</w:t>
-      </w:r>
-      <w:proofErr w:type="spellEnd"/>
-      <w:r>
-        <w:t xml:space="preserve"> u proměnné NO2 na hodnotu 125</w:t>
+        <w:t>stejně aplikujeme jednostrannou winsorizaci u proměnné NO2 na hodnotu 125</w:t>
       </w:r>
     </w:p>
     <w:p>
@@ -4908,21 +7365,8 @@
           <w:numId w:val="7"/>
         </w:numPr>
       </w:pPr>
-      <w:proofErr w:type="spellStart"/>
-      <w:r>
-        <w:t>den_v_tydnu</w:t>
-      </w:r>
-      <w:proofErr w:type="spellEnd"/>
-      <w:r>
-        <w:t xml:space="preserve"> – textová proměnná odvozena z data a času (</w:t>
-      </w:r>
-      <w:proofErr w:type="spellStart"/>
-      <w:r>
-        <w:t>cas</w:t>
-      </w:r>
-      <w:proofErr w:type="spellEnd"/>
-      <w:r>
-        <w:t>), přepisuje anglické názvy dnů na české zkratky („po“ až „ne“) a nastavuje jejich pořadí.</w:t>
+      <w:r>
+        <w:t>den_v_tydnu – textová proměnná odvozena z data a času (cas), přepisuje anglické názvy dnů na české zkratky („po“ až „ne“) a nastavuje jejich pořadí.</w:t>
       </w:r>
     </w:p>
     <w:p>
@@ -4933,21 +7377,8 @@
           <w:numId w:val="7"/>
         </w:numPr>
       </w:pPr>
-      <w:proofErr w:type="spellStart"/>
-      <w:r>
-        <w:t>month</w:t>
-      </w:r>
-      <w:proofErr w:type="spellEnd"/>
-      <w:r>
-        <w:t xml:space="preserve"> – proměnná s informací o měsíci ve formátu MM/YYYY, získaná z proměnné </w:t>
-      </w:r>
-      <w:proofErr w:type="spellStart"/>
-      <w:r>
-        <w:t>cas</w:t>
-      </w:r>
-      <w:proofErr w:type="spellEnd"/>
-      <w:r>
-        <w:t>.</w:t>
+      <w:r>
+        <w:t>month – proměnná s informací o měsíci ve formátu MM/YYYY, získaná z proměnné cas.</w:t>
       </w:r>
     </w:p>
     <w:p>
@@ -4958,13 +7389,8 @@
           <w:numId w:val="7"/>
         </w:numPr>
       </w:pPr>
-      <w:proofErr w:type="spellStart"/>
-      <w:r>
-        <w:t>tretina_dne</w:t>
-      </w:r>
-      <w:proofErr w:type="spellEnd"/>
-      <w:r>
-        <w:t xml:space="preserve"> – rozdělení dne do třetin podle hodin:</w:t>
+      <w:r>
+        <w:t>tretina_dne – rozdělení dne do třetin podle hodin:</w:t>
       </w:r>
     </w:p>
     <w:p>
@@ -5017,13 +7443,8 @@
           <w:numId w:val="7"/>
         </w:numPr>
       </w:pPr>
-      <w:proofErr w:type="spellStart"/>
-      <w:r>
-        <w:t>letni_prazdniny</w:t>
-      </w:r>
-      <w:proofErr w:type="spellEnd"/>
-      <w:r>
-        <w:t xml:space="preserve"> – binární proměnná indikující letní prázdniny (červenec a srpen).</w:t>
+      <w:r>
+        <w:t>letni_prazdniny – binární proměnná indikující letní prázdniny (červenec a srpen).</w:t>
       </w:r>
     </w:p>
     <w:p>
@@ -5034,13 +7455,8 @@
           <w:numId w:val="7"/>
         </w:numPr>
       </w:pPr>
-      <w:proofErr w:type="spellStart"/>
-      <w:r>
-        <w:t>topna_sezona</w:t>
-      </w:r>
-      <w:proofErr w:type="spellEnd"/>
-      <w:r>
-        <w:t xml:space="preserve"> – binární proměnná označující topnou sezónu (říjen až duben).</w:t>
+      <w:r>
+        <w:t>topna_sezona – binární proměnná označující topnou sezónu (říjen až duben).</w:t>
       </w:r>
     </w:p>
     <w:p>
@@ -5051,13 +7467,8 @@
           <w:numId w:val="7"/>
         </w:numPr>
       </w:pPr>
-      <w:proofErr w:type="spellStart"/>
-      <w:r>
-        <w:t>statni_svatky</w:t>
-      </w:r>
-      <w:proofErr w:type="spellEnd"/>
-      <w:r>
-        <w:t xml:space="preserve"> – binární proměnná indikující, zda daný den je státní svátek (podle oficiálních svátků ČR v roce 2024).</w:t>
+      <w:r>
+        <w:t>statni_svatky – binární proměnná indikující, zda daný den je státní svátek (podle oficiálních svátků ČR v roce 2024).</w:t>
       </w:r>
     </w:p>
     <w:p>
@@ -5068,13 +7479,60 @@
           <w:numId w:val="7"/>
         </w:numPr>
       </w:pPr>
-      <w:proofErr w:type="spellStart"/>
-      <w:r>
-        <w:t>prumerna_teplota_dne</w:t>
-      </w:r>
-      <w:proofErr w:type="spellEnd"/>
-      <w:r>
-        <w:t xml:space="preserve"> – průměrná denní teplota vypočítaná ze 4 hodnot: teplota v 7:00, 14:00 a dvakrát v 21:00 hodin</w:t>
+      <w:r>
+        <w:t xml:space="preserve">prumerna_teplota_dne – průměrná denní teplota vypočítaná ze 4 hodnot: teplota v 7:00, 14:00 </w:t>
+      </w:r>
+      <w:r>
+        <w:t xml:space="preserve">a </w:t>
+      </w:r>
+      <w:r>
+        <w:t>dvakrát v 21:00 hodin</w:t>
+      </w:r>
+    </w:p>
+    <w:p>
+      <w:pPr>
+        <w:rPr>
+          <w:rFonts w:asciiTheme="majorHAnsi" w:eastAsiaTheme="majorEastAsia" w:hAnsiTheme="majorHAnsi" w:cstheme="majorBidi"/>
+          <w:color w:val="0F4761" w:themeColor="accent1" w:themeShade="BF"/>
+          <w:sz w:val="32"/>
+          <w:szCs w:val="32"/>
+        </w:rPr>
+      </w:pPr>
+      <w:r>
+        <w:br w:type="page"/>
+      </w:r>
+    </w:p>
+    <w:p>
+      <w:pPr>
+        <w:pStyle w:val="Nadpis2"/>
+      </w:pPr>
+      <w:r>
+        <w:lastRenderedPageBreak/>
+        <w:t>Problém s ukládáním dat, která jsou upravená</w:t>
+      </w:r>
+    </w:p>
+    <w:p>
+      <w:pPr>
+        <w:pStyle w:val="Odstavecseseznamem"/>
+        <w:numPr>
+          <w:ilvl w:val="0"/>
+          <w:numId w:val="7"/>
+        </w:numPr>
+      </w:pPr>
+      <w:r>
+        <w:t>měl jsem problém, že když jsem uložil upravená, sjednocená, agregovaná data do .csv souboru, některé hodnoty se rozbily v důsledku nezachování typu (například časová hodnota dd/mm/yyyy 00:00 se uložila jen jako dd/mm/yyyy)</w:t>
+      </w:r>
+    </w:p>
+    <w:p>
+      <w:pPr>
+        <w:pStyle w:val="Odstavecseseznamem"/>
+        <w:numPr>
+          <w:ilvl w:val="0"/>
+          <w:numId w:val="7"/>
+        </w:numPr>
+      </w:pPr>
+      <w:r>
+        <w:t>proto momentálně ukládám datové soubory jako .rds, soubor od rka, který zachovává i datové typy</w:t>
       </w:r>
     </w:p>
     <w:p/>
@@ -5206,6 +7664,304 @@
     </w:lvl>
   </w:abstractNum>
   <w:abstractNum w:abstractNumId="1" w15:restartNumberingAfterBreak="0">
+    <w:nsid w:val="09D862BF"/>
+    <w:multiLevelType w:val="multilevel"/>
+    <w:tmpl w:val="019AB92C"/>
+    <w:lvl w:ilvl="0">
+      <w:start w:val="1"/>
+      <w:numFmt w:val="bullet"/>
+      <w:lvlText w:val=""/>
+      <w:lvlJc w:val="left"/>
+      <w:pPr>
+        <w:tabs>
+          <w:tab w:val="num" w:pos="720"/>
+        </w:tabs>
+        <w:ind w:left="720" w:hanging="360"/>
+      </w:pPr>
+      <w:rPr>
+        <w:rFonts w:ascii="Symbol" w:hAnsi="Symbol" w:hint="default"/>
+        <w:sz w:val="20"/>
+      </w:rPr>
+    </w:lvl>
+    <w:lvl w:ilvl="1" w:tentative="1">
+      <w:start w:val="1"/>
+      <w:numFmt w:val="bullet"/>
+      <w:lvlText w:val="o"/>
+      <w:lvlJc w:val="left"/>
+      <w:pPr>
+        <w:tabs>
+          <w:tab w:val="num" w:pos="1440"/>
+        </w:tabs>
+        <w:ind w:left="1440" w:hanging="360"/>
+      </w:pPr>
+      <w:rPr>
+        <w:rFonts w:ascii="Courier New" w:hAnsi="Courier New" w:hint="default"/>
+        <w:sz w:val="20"/>
+      </w:rPr>
+    </w:lvl>
+    <w:lvl w:ilvl="2" w:tentative="1">
+      <w:start w:val="1"/>
+      <w:numFmt w:val="bullet"/>
+      <w:lvlText w:val=""/>
+      <w:lvlJc w:val="left"/>
+      <w:pPr>
+        <w:tabs>
+          <w:tab w:val="num" w:pos="2160"/>
+        </w:tabs>
+        <w:ind w:left="2160" w:hanging="360"/>
+      </w:pPr>
+      <w:rPr>
+        <w:rFonts w:ascii="Wingdings" w:hAnsi="Wingdings" w:hint="default"/>
+        <w:sz w:val="20"/>
+      </w:rPr>
+    </w:lvl>
+    <w:lvl w:ilvl="3" w:tentative="1">
+      <w:start w:val="1"/>
+      <w:numFmt w:val="bullet"/>
+      <w:lvlText w:val=""/>
+      <w:lvlJc w:val="left"/>
+      <w:pPr>
+        <w:tabs>
+          <w:tab w:val="num" w:pos="2880"/>
+        </w:tabs>
+        <w:ind w:left="2880" w:hanging="360"/>
+      </w:pPr>
+      <w:rPr>
+        <w:rFonts w:ascii="Wingdings" w:hAnsi="Wingdings" w:hint="default"/>
+        <w:sz w:val="20"/>
+      </w:rPr>
+    </w:lvl>
+    <w:lvl w:ilvl="4" w:tentative="1">
+      <w:start w:val="1"/>
+      <w:numFmt w:val="bullet"/>
+      <w:lvlText w:val=""/>
+      <w:lvlJc w:val="left"/>
+      <w:pPr>
+        <w:tabs>
+          <w:tab w:val="num" w:pos="3600"/>
+        </w:tabs>
+        <w:ind w:left="3600" w:hanging="360"/>
+      </w:pPr>
+      <w:rPr>
+        <w:rFonts w:ascii="Wingdings" w:hAnsi="Wingdings" w:hint="default"/>
+        <w:sz w:val="20"/>
+      </w:rPr>
+    </w:lvl>
+    <w:lvl w:ilvl="5" w:tentative="1">
+      <w:start w:val="1"/>
+      <w:numFmt w:val="bullet"/>
+      <w:lvlText w:val=""/>
+      <w:lvlJc w:val="left"/>
+      <w:pPr>
+        <w:tabs>
+          <w:tab w:val="num" w:pos="4320"/>
+        </w:tabs>
+        <w:ind w:left="4320" w:hanging="360"/>
+      </w:pPr>
+      <w:rPr>
+        <w:rFonts w:ascii="Wingdings" w:hAnsi="Wingdings" w:hint="default"/>
+        <w:sz w:val="20"/>
+      </w:rPr>
+    </w:lvl>
+    <w:lvl w:ilvl="6" w:tentative="1">
+      <w:start w:val="1"/>
+      <w:numFmt w:val="bullet"/>
+      <w:lvlText w:val=""/>
+      <w:lvlJc w:val="left"/>
+      <w:pPr>
+        <w:tabs>
+          <w:tab w:val="num" w:pos="5040"/>
+        </w:tabs>
+        <w:ind w:left="5040" w:hanging="360"/>
+      </w:pPr>
+      <w:rPr>
+        <w:rFonts w:ascii="Wingdings" w:hAnsi="Wingdings" w:hint="default"/>
+        <w:sz w:val="20"/>
+      </w:rPr>
+    </w:lvl>
+    <w:lvl w:ilvl="7" w:tentative="1">
+      <w:start w:val="1"/>
+      <w:numFmt w:val="bullet"/>
+      <w:lvlText w:val=""/>
+      <w:lvlJc w:val="left"/>
+      <w:pPr>
+        <w:tabs>
+          <w:tab w:val="num" w:pos="5760"/>
+        </w:tabs>
+        <w:ind w:left="5760" w:hanging="360"/>
+      </w:pPr>
+      <w:rPr>
+        <w:rFonts w:ascii="Wingdings" w:hAnsi="Wingdings" w:hint="default"/>
+        <w:sz w:val="20"/>
+      </w:rPr>
+    </w:lvl>
+    <w:lvl w:ilvl="8" w:tentative="1">
+      <w:start w:val="1"/>
+      <w:numFmt w:val="bullet"/>
+      <w:lvlText w:val=""/>
+      <w:lvlJc w:val="left"/>
+      <w:pPr>
+        <w:tabs>
+          <w:tab w:val="num" w:pos="6480"/>
+        </w:tabs>
+        <w:ind w:left="6480" w:hanging="360"/>
+      </w:pPr>
+      <w:rPr>
+        <w:rFonts w:ascii="Wingdings" w:hAnsi="Wingdings" w:hint="default"/>
+        <w:sz w:val="20"/>
+      </w:rPr>
+    </w:lvl>
+  </w:abstractNum>
+  <w:abstractNum w:abstractNumId="2" w15:restartNumberingAfterBreak="0">
+    <w:nsid w:val="0B091B51"/>
+    <w:multiLevelType w:val="multilevel"/>
+    <w:tmpl w:val="422C0C54"/>
+    <w:lvl w:ilvl="0">
+      <w:start w:val="1"/>
+      <w:numFmt w:val="bullet"/>
+      <w:lvlText w:val=""/>
+      <w:lvlJc w:val="left"/>
+      <w:pPr>
+        <w:tabs>
+          <w:tab w:val="num" w:pos="720"/>
+        </w:tabs>
+        <w:ind w:left="720" w:hanging="360"/>
+      </w:pPr>
+      <w:rPr>
+        <w:rFonts w:ascii="Symbol" w:hAnsi="Symbol" w:hint="default"/>
+        <w:sz w:val="20"/>
+      </w:rPr>
+    </w:lvl>
+    <w:lvl w:ilvl="1" w:tentative="1">
+      <w:start w:val="1"/>
+      <w:numFmt w:val="bullet"/>
+      <w:lvlText w:val="o"/>
+      <w:lvlJc w:val="left"/>
+      <w:pPr>
+        <w:tabs>
+          <w:tab w:val="num" w:pos="1440"/>
+        </w:tabs>
+        <w:ind w:left="1440" w:hanging="360"/>
+      </w:pPr>
+      <w:rPr>
+        <w:rFonts w:ascii="Courier New" w:hAnsi="Courier New" w:hint="default"/>
+        <w:sz w:val="20"/>
+      </w:rPr>
+    </w:lvl>
+    <w:lvl w:ilvl="2" w:tentative="1">
+      <w:start w:val="1"/>
+      <w:numFmt w:val="bullet"/>
+      <w:lvlText w:val=""/>
+      <w:lvlJc w:val="left"/>
+      <w:pPr>
+        <w:tabs>
+          <w:tab w:val="num" w:pos="2160"/>
+        </w:tabs>
+        <w:ind w:left="2160" w:hanging="360"/>
+      </w:pPr>
+      <w:rPr>
+        <w:rFonts w:ascii="Wingdings" w:hAnsi="Wingdings" w:hint="default"/>
+        <w:sz w:val="20"/>
+      </w:rPr>
+    </w:lvl>
+    <w:lvl w:ilvl="3" w:tentative="1">
+      <w:start w:val="1"/>
+      <w:numFmt w:val="bullet"/>
+      <w:lvlText w:val=""/>
+      <w:lvlJc w:val="left"/>
+      <w:pPr>
+        <w:tabs>
+          <w:tab w:val="num" w:pos="2880"/>
+        </w:tabs>
+        <w:ind w:left="2880" w:hanging="360"/>
+      </w:pPr>
+      <w:rPr>
+        <w:rFonts w:ascii="Wingdings" w:hAnsi="Wingdings" w:hint="default"/>
+        <w:sz w:val="20"/>
+      </w:rPr>
+    </w:lvl>
+    <w:lvl w:ilvl="4" w:tentative="1">
+      <w:start w:val="1"/>
+      <w:numFmt w:val="bullet"/>
+      <w:lvlText w:val=""/>
+      <w:lvlJc w:val="left"/>
+      <w:pPr>
+        <w:tabs>
+          <w:tab w:val="num" w:pos="3600"/>
+        </w:tabs>
+        <w:ind w:left="3600" w:hanging="360"/>
+      </w:pPr>
+      <w:rPr>
+        <w:rFonts w:ascii="Wingdings" w:hAnsi="Wingdings" w:hint="default"/>
+        <w:sz w:val="20"/>
+      </w:rPr>
+    </w:lvl>
+    <w:lvl w:ilvl="5" w:tentative="1">
+      <w:start w:val="1"/>
+      <w:numFmt w:val="bullet"/>
+      <w:lvlText w:val=""/>
+      <w:lvlJc w:val="left"/>
+      <w:pPr>
+        <w:tabs>
+          <w:tab w:val="num" w:pos="4320"/>
+        </w:tabs>
+        <w:ind w:left="4320" w:hanging="360"/>
+      </w:pPr>
+      <w:rPr>
+        <w:rFonts w:ascii="Wingdings" w:hAnsi="Wingdings" w:hint="default"/>
+        <w:sz w:val="20"/>
+      </w:rPr>
+    </w:lvl>
+    <w:lvl w:ilvl="6" w:tentative="1">
+      <w:start w:val="1"/>
+      <w:numFmt w:val="bullet"/>
+      <w:lvlText w:val=""/>
+      <w:lvlJc w:val="left"/>
+      <w:pPr>
+        <w:tabs>
+          <w:tab w:val="num" w:pos="5040"/>
+        </w:tabs>
+        <w:ind w:left="5040" w:hanging="360"/>
+      </w:pPr>
+      <w:rPr>
+        <w:rFonts w:ascii="Wingdings" w:hAnsi="Wingdings" w:hint="default"/>
+        <w:sz w:val="20"/>
+      </w:rPr>
+    </w:lvl>
+    <w:lvl w:ilvl="7" w:tentative="1">
+      <w:start w:val="1"/>
+      <w:numFmt w:val="bullet"/>
+      <w:lvlText w:val=""/>
+      <w:lvlJc w:val="left"/>
+      <w:pPr>
+        <w:tabs>
+          <w:tab w:val="num" w:pos="5760"/>
+        </w:tabs>
+        <w:ind w:left="5760" w:hanging="360"/>
+      </w:pPr>
+      <w:rPr>
+        <w:rFonts w:ascii="Wingdings" w:hAnsi="Wingdings" w:hint="default"/>
+        <w:sz w:val="20"/>
+      </w:rPr>
+    </w:lvl>
+    <w:lvl w:ilvl="8" w:tentative="1">
+      <w:start w:val="1"/>
+      <w:numFmt w:val="bullet"/>
+      <w:lvlText w:val=""/>
+      <w:lvlJc w:val="left"/>
+      <w:pPr>
+        <w:tabs>
+          <w:tab w:val="num" w:pos="6480"/>
+        </w:tabs>
+        <w:ind w:left="6480" w:hanging="360"/>
+      </w:pPr>
+      <w:rPr>
+        <w:rFonts w:ascii="Wingdings" w:hAnsi="Wingdings" w:hint="default"/>
+        <w:sz w:val="20"/>
+      </w:rPr>
+    </w:lvl>
+  </w:abstractNum>
+  <w:abstractNum w:abstractNumId="3" w15:restartNumberingAfterBreak="0">
     <w:nsid w:val="0C5E1832"/>
     <w:multiLevelType w:val="hybridMultilevel"/>
     <w:tmpl w:val="4FDE45DE"/>
@@ -5294,7 +8050,715 @@
       </w:pPr>
     </w:lvl>
   </w:abstractNum>
-  <w:abstractNum w:abstractNumId="2" w15:restartNumberingAfterBreak="0">
+  <w:abstractNum w:abstractNumId="4" w15:restartNumberingAfterBreak="0">
+    <w:nsid w:val="15674227"/>
+    <w:multiLevelType w:val="hybridMultilevel"/>
+    <w:tmpl w:val="5ADAD724"/>
+    <w:lvl w:ilvl="0" w:tplc="278A29A0">
+      <w:numFmt w:val="bullet"/>
+      <w:lvlText w:val="-"/>
+      <w:lvlJc w:val="left"/>
+      <w:pPr>
+        <w:ind w:left="720" w:hanging="360"/>
+      </w:pPr>
+      <w:rPr>
+        <w:rFonts w:ascii="Aptos" w:eastAsiaTheme="minorHAnsi" w:hAnsi="Aptos" w:cstheme="minorBidi" w:hint="default"/>
+      </w:rPr>
+    </w:lvl>
+    <w:lvl w:ilvl="1" w:tplc="04050003" w:tentative="1">
+      <w:start w:val="1"/>
+      <w:numFmt w:val="bullet"/>
+      <w:lvlText w:val="o"/>
+      <w:lvlJc w:val="left"/>
+      <w:pPr>
+        <w:ind w:left="1440" w:hanging="360"/>
+      </w:pPr>
+      <w:rPr>
+        <w:rFonts w:ascii="Courier New" w:hAnsi="Courier New" w:cs="Courier New" w:hint="default"/>
+      </w:rPr>
+    </w:lvl>
+    <w:lvl w:ilvl="2" w:tplc="04050005" w:tentative="1">
+      <w:start w:val="1"/>
+      <w:numFmt w:val="bullet"/>
+      <w:lvlText w:val=""/>
+      <w:lvlJc w:val="left"/>
+      <w:pPr>
+        <w:ind w:left="2160" w:hanging="360"/>
+      </w:pPr>
+      <w:rPr>
+        <w:rFonts w:ascii="Wingdings" w:hAnsi="Wingdings" w:hint="default"/>
+      </w:rPr>
+    </w:lvl>
+    <w:lvl w:ilvl="3" w:tplc="04050001" w:tentative="1">
+      <w:start w:val="1"/>
+      <w:numFmt w:val="bullet"/>
+      <w:lvlText w:val=""/>
+      <w:lvlJc w:val="left"/>
+      <w:pPr>
+        <w:ind w:left="2880" w:hanging="360"/>
+      </w:pPr>
+      <w:rPr>
+        <w:rFonts w:ascii="Symbol" w:hAnsi="Symbol" w:hint="default"/>
+      </w:rPr>
+    </w:lvl>
+    <w:lvl w:ilvl="4" w:tplc="04050003" w:tentative="1">
+      <w:start w:val="1"/>
+      <w:numFmt w:val="bullet"/>
+      <w:lvlText w:val="o"/>
+      <w:lvlJc w:val="left"/>
+      <w:pPr>
+        <w:ind w:left="3600" w:hanging="360"/>
+      </w:pPr>
+      <w:rPr>
+        <w:rFonts w:ascii="Courier New" w:hAnsi="Courier New" w:cs="Courier New" w:hint="default"/>
+      </w:rPr>
+    </w:lvl>
+    <w:lvl w:ilvl="5" w:tplc="04050005" w:tentative="1">
+      <w:start w:val="1"/>
+      <w:numFmt w:val="bullet"/>
+      <w:lvlText w:val=""/>
+      <w:lvlJc w:val="left"/>
+      <w:pPr>
+        <w:ind w:left="4320" w:hanging="360"/>
+      </w:pPr>
+      <w:rPr>
+        <w:rFonts w:ascii="Wingdings" w:hAnsi="Wingdings" w:hint="default"/>
+      </w:rPr>
+    </w:lvl>
+    <w:lvl w:ilvl="6" w:tplc="04050001" w:tentative="1">
+      <w:start w:val="1"/>
+      <w:numFmt w:val="bullet"/>
+      <w:lvlText w:val=""/>
+      <w:lvlJc w:val="left"/>
+      <w:pPr>
+        <w:ind w:left="5040" w:hanging="360"/>
+      </w:pPr>
+      <w:rPr>
+        <w:rFonts w:ascii="Symbol" w:hAnsi="Symbol" w:hint="default"/>
+      </w:rPr>
+    </w:lvl>
+    <w:lvl w:ilvl="7" w:tplc="04050003" w:tentative="1">
+      <w:start w:val="1"/>
+      <w:numFmt w:val="bullet"/>
+      <w:lvlText w:val="o"/>
+      <w:lvlJc w:val="left"/>
+      <w:pPr>
+        <w:ind w:left="5760" w:hanging="360"/>
+      </w:pPr>
+      <w:rPr>
+        <w:rFonts w:ascii="Courier New" w:hAnsi="Courier New" w:cs="Courier New" w:hint="default"/>
+      </w:rPr>
+    </w:lvl>
+    <w:lvl w:ilvl="8" w:tplc="04050005" w:tentative="1">
+      <w:start w:val="1"/>
+      <w:numFmt w:val="bullet"/>
+      <w:lvlText w:val=""/>
+      <w:lvlJc w:val="left"/>
+      <w:pPr>
+        <w:ind w:left="6480" w:hanging="360"/>
+      </w:pPr>
+      <w:rPr>
+        <w:rFonts w:ascii="Wingdings" w:hAnsi="Wingdings" w:hint="default"/>
+      </w:rPr>
+    </w:lvl>
+  </w:abstractNum>
+  <w:abstractNum w:abstractNumId="5" w15:restartNumberingAfterBreak="0">
+    <w:nsid w:val="17C470DB"/>
+    <w:multiLevelType w:val="multilevel"/>
+    <w:tmpl w:val="92FC56EE"/>
+    <w:lvl w:ilvl="0">
+      <w:start w:val="1"/>
+      <w:numFmt w:val="bullet"/>
+      <w:lvlText w:val=""/>
+      <w:lvlJc w:val="left"/>
+      <w:pPr>
+        <w:tabs>
+          <w:tab w:val="num" w:pos="720"/>
+        </w:tabs>
+        <w:ind w:left="720" w:hanging="360"/>
+      </w:pPr>
+      <w:rPr>
+        <w:rFonts w:ascii="Symbol" w:hAnsi="Symbol" w:hint="default"/>
+        <w:sz w:val="20"/>
+      </w:rPr>
+    </w:lvl>
+    <w:lvl w:ilvl="1" w:tentative="1">
+      <w:start w:val="1"/>
+      <w:numFmt w:val="bullet"/>
+      <w:lvlText w:val="o"/>
+      <w:lvlJc w:val="left"/>
+      <w:pPr>
+        <w:tabs>
+          <w:tab w:val="num" w:pos="1440"/>
+        </w:tabs>
+        <w:ind w:left="1440" w:hanging="360"/>
+      </w:pPr>
+      <w:rPr>
+        <w:rFonts w:ascii="Courier New" w:hAnsi="Courier New" w:hint="default"/>
+        <w:sz w:val="20"/>
+      </w:rPr>
+    </w:lvl>
+    <w:lvl w:ilvl="2" w:tentative="1">
+      <w:start w:val="1"/>
+      <w:numFmt w:val="bullet"/>
+      <w:lvlText w:val=""/>
+      <w:lvlJc w:val="left"/>
+      <w:pPr>
+        <w:tabs>
+          <w:tab w:val="num" w:pos="2160"/>
+        </w:tabs>
+        <w:ind w:left="2160" w:hanging="360"/>
+      </w:pPr>
+      <w:rPr>
+        <w:rFonts w:ascii="Wingdings" w:hAnsi="Wingdings" w:hint="default"/>
+        <w:sz w:val="20"/>
+      </w:rPr>
+    </w:lvl>
+    <w:lvl w:ilvl="3" w:tentative="1">
+      <w:start w:val="1"/>
+      <w:numFmt w:val="bullet"/>
+      <w:lvlText w:val=""/>
+      <w:lvlJc w:val="left"/>
+      <w:pPr>
+        <w:tabs>
+          <w:tab w:val="num" w:pos="2880"/>
+        </w:tabs>
+        <w:ind w:left="2880" w:hanging="360"/>
+      </w:pPr>
+      <w:rPr>
+        <w:rFonts w:ascii="Wingdings" w:hAnsi="Wingdings" w:hint="default"/>
+        <w:sz w:val="20"/>
+      </w:rPr>
+    </w:lvl>
+    <w:lvl w:ilvl="4" w:tentative="1">
+      <w:start w:val="1"/>
+      <w:numFmt w:val="bullet"/>
+      <w:lvlText w:val=""/>
+      <w:lvlJc w:val="left"/>
+      <w:pPr>
+        <w:tabs>
+          <w:tab w:val="num" w:pos="3600"/>
+        </w:tabs>
+        <w:ind w:left="3600" w:hanging="360"/>
+      </w:pPr>
+      <w:rPr>
+        <w:rFonts w:ascii="Wingdings" w:hAnsi="Wingdings" w:hint="default"/>
+        <w:sz w:val="20"/>
+      </w:rPr>
+    </w:lvl>
+    <w:lvl w:ilvl="5" w:tentative="1">
+      <w:start w:val="1"/>
+      <w:numFmt w:val="bullet"/>
+      <w:lvlText w:val=""/>
+      <w:lvlJc w:val="left"/>
+      <w:pPr>
+        <w:tabs>
+          <w:tab w:val="num" w:pos="4320"/>
+        </w:tabs>
+        <w:ind w:left="4320" w:hanging="360"/>
+      </w:pPr>
+      <w:rPr>
+        <w:rFonts w:ascii="Wingdings" w:hAnsi="Wingdings" w:hint="default"/>
+        <w:sz w:val="20"/>
+      </w:rPr>
+    </w:lvl>
+    <w:lvl w:ilvl="6" w:tentative="1">
+      <w:start w:val="1"/>
+      <w:numFmt w:val="bullet"/>
+      <w:lvlText w:val=""/>
+      <w:lvlJc w:val="left"/>
+      <w:pPr>
+        <w:tabs>
+          <w:tab w:val="num" w:pos="5040"/>
+        </w:tabs>
+        <w:ind w:left="5040" w:hanging="360"/>
+      </w:pPr>
+      <w:rPr>
+        <w:rFonts w:ascii="Wingdings" w:hAnsi="Wingdings" w:hint="default"/>
+        <w:sz w:val="20"/>
+      </w:rPr>
+    </w:lvl>
+    <w:lvl w:ilvl="7" w:tentative="1">
+      <w:start w:val="1"/>
+      <w:numFmt w:val="bullet"/>
+      <w:lvlText w:val=""/>
+      <w:lvlJc w:val="left"/>
+      <w:pPr>
+        <w:tabs>
+          <w:tab w:val="num" w:pos="5760"/>
+        </w:tabs>
+        <w:ind w:left="5760" w:hanging="360"/>
+      </w:pPr>
+      <w:rPr>
+        <w:rFonts w:ascii="Wingdings" w:hAnsi="Wingdings" w:hint="default"/>
+        <w:sz w:val="20"/>
+      </w:rPr>
+    </w:lvl>
+    <w:lvl w:ilvl="8" w:tentative="1">
+      <w:start w:val="1"/>
+      <w:numFmt w:val="bullet"/>
+      <w:lvlText w:val=""/>
+      <w:lvlJc w:val="left"/>
+      <w:pPr>
+        <w:tabs>
+          <w:tab w:val="num" w:pos="6480"/>
+        </w:tabs>
+        <w:ind w:left="6480" w:hanging="360"/>
+      </w:pPr>
+      <w:rPr>
+        <w:rFonts w:ascii="Wingdings" w:hAnsi="Wingdings" w:hint="default"/>
+        <w:sz w:val="20"/>
+      </w:rPr>
+    </w:lvl>
+  </w:abstractNum>
+  <w:abstractNum w:abstractNumId="6" w15:restartNumberingAfterBreak="0">
+    <w:nsid w:val="18901402"/>
+    <w:multiLevelType w:val="multilevel"/>
+    <w:tmpl w:val="811A2A9E"/>
+    <w:lvl w:ilvl="0">
+      <w:start w:val="1"/>
+      <w:numFmt w:val="bullet"/>
+      <w:lvlText w:val=""/>
+      <w:lvlJc w:val="left"/>
+      <w:pPr>
+        <w:tabs>
+          <w:tab w:val="num" w:pos="720"/>
+        </w:tabs>
+        <w:ind w:left="720" w:hanging="360"/>
+      </w:pPr>
+      <w:rPr>
+        <w:rFonts w:ascii="Symbol" w:hAnsi="Symbol" w:hint="default"/>
+        <w:sz w:val="20"/>
+      </w:rPr>
+    </w:lvl>
+    <w:lvl w:ilvl="1" w:tentative="1">
+      <w:start w:val="1"/>
+      <w:numFmt w:val="bullet"/>
+      <w:lvlText w:val="o"/>
+      <w:lvlJc w:val="left"/>
+      <w:pPr>
+        <w:tabs>
+          <w:tab w:val="num" w:pos="1440"/>
+        </w:tabs>
+        <w:ind w:left="1440" w:hanging="360"/>
+      </w:pPr>
+      <w:rPr>
+        <w:rFonts w:ascii="Courier New" w:hAnsi="Courier New" w:hint="default"/>
+        <w:sz w:val="20"/>
+      </w:rPr>
+    </w:lvl>
+    <w:lvl w:ilvl="2" w:tentative="1">
+      <w:start w:val="1"/>
+      <w:numFmt w:val="bullet"/>
+      <w:lvlText w:val=""/>
+      <w:lvlJc w:val="left"/>
+      <w:pPr>
+        <w:tabs>
+          <w:tab w:val="num" w:pos="2160"/>
+        </w:tabs>
+        <w:ind w:left="2160" w:hanging="360"/>
+      </w:pPr>
+      <w:rPr>
+        <w:rFonts w:ascii="Wingdings" w:hAnsi="Wingdings" w:hint="default"/>
+        <w:sz w:val="20"/>
+      </w:rPr>
+    </w:lvl>
+    <w:lvl w:ilvl="3" w:tentative="1">
+      <w:start w:val="1"/>
+      <w:numFmt w:val="bullet"/>
+      <w:lvlText w:val=""/>
+      <w:lvlJc w:val="left"/>
+      <w:pPr>
+        <w:tabs>
+          <w:tab w:val="num" w:pos="2880"/>
+        </w:tabs>
+        <w:ind w:left="2880" w:hanging="360"/>
+      </w:pPr>
+      <w:rPr>
+        <w:rFonts w:ascii="Wingdings" w:hAnsi="Wingdings" w:hint="default"/>
+        <w:sz w:val="20"/>
+      </w:rPr>
+    </w:lvl>
+    <w:lvl w:ilvl="4" w:tentative="1">
+      <w:start w:val="1"/>
+      <w:numFmt w:val="bullet"/>
+      <w:lvlText w:val=""/>
+      <w:lvlJc w:val="left"/>
+      <w:pPr>
+        <w:tabs>
+          <w:tab w:val="num" w:pos="3600"/>
+        </w:tabs>
+        <w:ind w:left="3600" w:hanging="360"/>
+      </w:pPr>
+      <w:rPr>
+        <w:rFonts w:ascii="Wingdings" w:hAnsi="Wingdings" w:hint="default"/>
+        <w:sz w:val="20"/>
+      </w:rPr>
+    </w:lvl>
+    <w:lvl w:ilvl="5" w:tentative="1">
+      <w:start w:val="1"/>
+      <w:numFmt w:val="bullet"/>
+      <w:lvlText w:val=""/>
+      <w:lvlJc w:val="left"/>
+      <w:pPr>
+        <w:tabs>
+          <w:tab w:val="num" w:pos="4320"/>
+        </w:tabs>
+        <w:ind w:left="4320" w:hanging="360"/>
+      </w:pPr>
+      <w:rPr>
+        <w:rFonts w:ascii="Wingdings" w:hAnsi="Wingdings" w:hint="default"/>
+        <w:sz w:val="20"/>
+      </w:rPr>
+    </w:lvl>
+    <w:lvl w:ilvl="6" w:tentative="1">
+      <w:start w:val="1"/>
+      <w:numFmt w:val="bullet"/>
+      <w:lvlText w:val=""/>
+      <w:lvlJc w:val="left"/>
+      <w:pPr>
+        <w:tabs>
+          <w:tab w:val="num" w:pos="5040"/>
+        </w:tabs>
+        <w:ind w:left="5040" w:hanging="360"/>
+      </w:pPr>
+      <w:rPr>
+        <w:rFonts w:ascii="Wingdings" w:hAnsi="Wingdings" w:hint="default"/>
+        <w:sz w:val="20"/>
+      </w:rPr>
+    </w:lvl>
+    <w:lvl w:ilvl="7" w:tentative="1">
+      <w:start w:val="1"/>
+      <w:numFmt w:val="bullet"/>
+      <w:lvlText w:val=""/>
+      <w:lvlJc w:val="left"/>
+      <w:pPr>
+        <w:tabs>
+          <w:tab w:val="num" w:pos="5760"/>
+        </w:tabs>
+        <w:ind w:left="5760" w:hanging="360"/>
+      </w:pPr>
+      <w:rPr>
+        <w:rFonts w:ascii="Wingdings" w:hAnsi="Wingdings" w:hint="default"/>
+        <w:sz w:val="20"/>
+      </w:rPr>
+    </w:lvl>
+    <w:lvl w:ilvl="8" w:tentative="1">
+      <w:start w:val="1"/>
+      <w:numFmt w:val="bullet"/>
+      <w:lvlText w:val=""/>
+      <w:lvlJc w:val="left"/>
+      <w:pPr>
+        <w:tabs>
+          <w:tab w:val="num" w:pos="6480"/>
+        </w:tabs>
+        <w:ind w:left="6480" w:hanging="360"/>
+      </w:pPr>
+      <w:rPr>
+        <w:rFonts w:ascii="Wingdings" w:hAnsi="Wingdings" w:hint="default"/>
+        <w:sz w:val="20"/>
+      </w:rPr>
+    </w:lvl>
+  </w:abstractNum>
+  <w:abstractNum w:abstractNumId="7" w15:restartNumberingAfterBreak="0">
+    <w:nsid w:val="242B3519"/>
+    <w:multiLevelType w:val="multilevel"/>
+    <w:tmpl w:val="96281A4A"/>
+    <w:lvl w:ilvl="0">
+      <w:start w:val="1"/>
+      <w:numFmt w:val="bullet"/>
+      <w:lvlText w:val=""/>
+      <w:lvlJc w:val="left"/>
+      <w:pPr>
+        <w:tabs>
+          <w:tab w:val="num" w:pos="720"/>
+        </w:tabs>
+        <w:ind w:left="720" w:hanging="360"/>
+      </w:pPr>
+      <w:rPr>
+        <w:rFonts w:ascii="Symbol" w:hAnsi="Symbol" w:hint="default"/>
+        <w:sz w:val="20"/>
+      </w:rPr>
+    </w:lvl>
+    <w:lvl w:ilvl="1" w:tentative="1">
+      <w:start w:val="1"/>
+      <w:numFmt w:val="bullet"/>
+      <w:lvlText w:val="o"/>
+      <w:lvlJc w:val="left"/>
+      <w:pPr>
+        <w:tabs>
+          <w:tab w:val="num" w:pos="1440"/>
+        </w:tabs>
+        <w:ind w:left="1440" w:hanging="360"/>
+      </w:pPr>
+      <w:rPr>
+        <w:rFonts w:ascii="Courier New" w:hAnsi="Courier New" w:hint="default"/>
+        <w:sz w:val="20"/>
+      </w:rPr>
+    </w:lvl>
+    <w:lvl w:ilvl="2" w:tentative="1">
+      <w:start w:val="1"/>
+      <w:numFmt w:val="bullet"/>
+      <w:lvlText w:val=""/>
+      <w:lvlJc w:val="left"/>
+      <w:pPr>
+        <w:tabs>
+          <w:tab w:val="num" w:pos="2160"/>
+        </w:tabs>
+        <w:ind w:left="2160" w:hanging="360"/>
+      </w:pPr>
+      <w:rPr>
+        <w:rFonts w:ascii="Wingdings" w:hAnsi="Wingdings" w:hint="default"/>
+        <w:sz w:val="20"/>
+      </w:rPr>
+    </w:lvl>
+    <w:lvl w:ilvl="3" w:tentative="1">
+      <w:start w:val="1"/>
+      <w:numFmt w:val="bullet"/>
+      <w:lvlText w:val=""/>
+      <w:lvlJc w:val="left"/>
+      <w:pPr>
+        <w:tabs>
+          <w:tab w:val="num" w:pos="2880"/>
+        </w:tabs>
+        <w:ind w:left="2880" w:hanging="360"/>
+      </w:pPr>
+      <w:rPr>
+        <w:rFonts w:ascii="Wingdings" w:hAnsi="Wingdings" w:hint="default"/>
+        <w:sz w:val="20"/>
+      </w:rPr>
+    </w:lvl>
+    <w:lvl w:ilvl="4" w:tentative="1">
+      <w:start w:val="1"/>
+      <w:numFmt w:val="bullet"/>
+      <w:lvlText w:val=""/>
+      <w:lvlJc w:val="left"/>
+      <w:pPr>
+        <w:tabs>
+          <w:tab w:val="num" w:pos="3600"/>
+        </w:tabs>
+        <w:ind w:left="3600" w:hanging="360"/>
+      </w:pPr>
+      <w:rPr>
+        <w:rFonts w:ascii="Wingdings" w:hAnsi="Wingdings" w:hint="default"/>
+        <w:sz w:val="20"/>
+      </w:rPr>
+    </w:lvl>
+    <w:lvl w:ilvl="5" w:tentative="1">
+      <w:start w:val="1"/>
+      <w:numFmt w:val="bullet"/>
+      <w:lvlText w:val=""/>
+      <w:lvlJc w:val="left"/>
+      <w:pPr>
+        <w:tabs>
+          <w:tab w:val="num" w:pos="4320"/>
+        </w:tabs>
+        <w:ind w:left="4320" w:hanging="360"/>
+      </w:pPr>
+      <w:rPr>
+        <w:rFonts w:ascii="Wingdings" w:hAnsi="Wingdings" w:hint="default"/>
+        <w:sz w:val="20"/>
+      </w:rPr>
+    </w:lvl>
+    <w:lvl w:ilvl="6" w:tentative="1">
+      <w:start w:val="1"/>
+      <w:numFmt w:val="bullet"/>
+      <w:lvlText w:val=""/>
+      <w:lvlJc w:val="left"/>
+      <w:pPr>
+        <w:tabs>
+          <w:tab w:val="num" w:pos="5040"/>
+        </w:tabs>
+        <w:ind w:left="5040" w:hanging="360"/>
+      </w:pPr>
+      <w:rPr>
+        <w:rFonts w:ascii="Wingdings" w:hAnsi="Wingdings" w:hint="default"/>
+        <w:sz w:val="20"/>
+      </w:rPr>
+    </w:lvl>
+    <w:lvl w:ilvl="7" w:tentative="1">
+      <w:start w:val="1"/>
+      <w:numFmt w:val="bullet"/>
+      <w:lvlText w:val=""/>
+      <w:lvlJc w:val="left"/>
+      <w:pPr>
+        <w:tabs>
+          <w:tab w:val="num" w:pos="5760"/>
+        </w:tabs>
+        <w:ind w:left="5760" w:hanging="360"/>
+      </w:pPr>
+      <w:rPr>
+        <w:rFonts w:ascii="Wingdings" w:hAnsi="Wingdings" w:hint="default"/>
+        <w:sz w:val="20"/>
+      </w:rPr>
+    </w:lvl>
+    <w:lvl w:ilvl="8" w:tentative="1">
+      <w:start w:val="1"/>
+      <w:numFmt w:val="bullet"/>
+      <w:lvlText w:val=""/>
+      <w:lvlJc w:val="left"/>
+      <w:pPr>
+        <w:tabs>
+          <w:tab w:val="num" w:pos="6480"/>
+        </w:tabs>
+        <w:ind w:left="6480" w:hanging="360"/>
+      </w:pPr>
+      <w:rPr>
+        <w:rFonts w:ascii="Wingdings" w:hAnsi="Wingdings" w:hint="default"/>
+        <w:sz w:val="20"/>
+      </w:rPr>
+    </w:lvl>
+  </w:abstractNum>
+  <w:abstractNum w:abstractNumId="8" w15:restartNumberingAfterBreak="0">
+    <w:nsid w:val="28365B8C"/>
+    <w:multiLevelType w:val="multilevel"/>
+    <w:tmpl w:val="865877B2"/>
+    <w:lvl w:ilvl="0">
+      <w:start w:val="1"/>
+      <w:numFmt w:val="bullet"/>
+      <w:lvlText w:val=""/>
+      <w:lvlJc w:val="left"/>
+      <w:pPr>
+        <w:tabs>
+          <w:tab w:val="num" w:pos="720"/>
+        </w:tabs>
+        <w:ind w:left="720" w:hanging="360"/>
+      </w:pPr>
+      <w:rPr>
+        <w:rFonts w:ascii="Symbol" w:hAnsi="Symbol" w:hint="default"/>
+        <w:sz w:val="20"/>
+      </w:rPr>
+    </w:lvl>
+    <w:lvl w:ilvl="1" w:tentative="1">
+      <w:start w:val="1"/>
+      <w:numFmt w:val="bullet"/>
+      <w:lvlText w:val="o"/>
+      <w:lvlJc w:val="left"/>
+      <w:pPr>
+        <w:tabs>
+          <w:tab w:val="num" w:pos="1440"/>
+        </w:tabs>
+        <w:ind w:left="1440" w:hanging="360"/>
+      </w:pPr>
+      <w:rPr>
+        <w:rFonts w:ascii="Courier New" w:hAnsi="Courier New" w:hint="default"/>
+        <w:sz w:val="20"/>
+      </w:rPr>
+    </w:lvl>
+    <w:lvl w:ilvl="2" w:tentative="1">
+      <w:start w:val="1"/>
+      <w:numFmt w:val="bullet"/>
+      <w:lvlText w:val=""/>
+      <w:lvlJc w:val="left"/>
+      <w:pPr>
+        <w:tabs>
+          <w:tab w:val="num" w:pos="2160"/>
+        </w:tabs>
+        <w:ind w:left="2160" w:hanging="360"/>
+      </w:pPr>
+      <w:rPr>
+        <w:rFonts w:ascii="Wingdings" w:hAnsi="Wingdings" w:hint="default"/>
+        <w:sz w:val="20"/>
+      </w:rPr>
+    </w:lvl>
+    <w:lvl w:ilvl="3" w:tentative="1">
+      <w:start w:val="1"/>
+      <w:numFmt w:val="bullet"/>
+      <w:lvlText w:val=""/>
+      <w:lvlJc w:val="left"/>
+      <w:pPr>
+        <w:tabs>
+          <w:tab w:val="num" w:pos="2880"/>
+        </w:tabs>
+        <w:ind w:left="2880" w:hanging="360"/>
+      </w:pPr>
+      <w:rPr>
+        <w:rFonts w:ascii="Wingdings" w:hAnsi="Wingdings" w:hint="default"/>
+        <w:sz w:val="20"/>
+      </w:rPr>
+    </w:lvl>
+    <w:lvl w:ilvl="4" w:tentative="1">
+      <w:start w:val="1"/>
+      <w:numFmt w:val="bullet"/>
+      <w:lvlText w:val=""/>
+      <w:lvlJc w:val="left"/>
+      <w:pPr>
+        <w:tabs>
+          <w:tab w:val="num" w:pos="3600"/>
+        </w:tabs>
+        <w:ind w:left="3600" w:hanging="360"/>
+      </w:pPr>
+      <w:rPr>
+        <w:rFonts w:ascii="Wingdings" w:hAnsi="Wingdings" w:hint="default"/>
+        <w:sz w:val="20"/>
+      </w:rPr>
+    </w:lvl>
+    <w:lvl w:ilvl="5" w:tentative="1">
+      <w:start w:val="1"/>
+      <w:numFmt w:val="bullet"/>
+      <w:lvlText w:val=""/>
+      <w:lvlJc w:val="left"/>
+      <w:pPr>
+        <w:tabs>
+          <w:tab w:val="num" w:pos="4320"/>
+        </w:tabs>
+        <w:ind w:left="4320" w:hanging="360"/>
+      </w:pPr>
+      <w:rPr>
+        <w:rFonts w:ascii="Wingdings" w:hAnsi="Wingdings" w:hint="default"/>
+        <w:sz w:val="20"/>
+      </w:rPr>
+    </w:lvl>
+    <w:lvl w:ilvl="6" w:tentative="1">
+      <w:start w:val="1"/>
+      <w:numFmt w:val="bullet"/>
+      <w:lvlText w:val=""/>
+      <w:lvlJc w:val="left"/>
+      <w:pPr>
+        <w:tabs>
+          <w:tab w:val="num" w:pos="5040"/>
+        </w:tabs>
+        <w:ind w:left="5040" w:hanging="360"/>
+      </w:pPr>
+      <w:rPr>
+        <w:rFonts w:ascii="Wingdings" w:hAnsi="Wingdings" w:hint="default"/>
+        <w:sz w:val="20"/>
+      </w:rPr>
+    </w:lvl>
+    <w:lvl w:ilvl="7" w:tentative="1">
+      <w:start w:val="1"/>
+      <w:numFmt w:val="bullet"/>
+      <w:lvlText w:val=""/>
+      <w:lvlJc w:val="left"/>
+      <w:pPr>
+        <w:tabs>
+          <w:tab w:val="num" w:pos="5760"/>
+        </w:tabs>
+        <w:ind w:left="5760" w:hanging="360"/>
+      </w:pPr>
+      <w:rPr>
+        <w:rFonts w:ascii="Wingdings" w:hAnsi="Wingdings" w:hint="default"/>
+        <w:sz w:val="20"/>
+      </w:rPr>
+    </w:lvl>
+    <w:lvl w:ilvl="8" w:tentative="1">
+      <w:start w:val="1"/>
+      <w:numFmt w:val="bullet"/>
+      <w:lvlText w:val=""/>
+      <w:lvlJc w:val="left"/>
+      <w:pPr>
+        <w:tabs>
+          <w:tab w:val="num" w:pos="6480"/>
+        </w:tabs>
+        <w:ind w:left="6480" w:hanging="360"/>
+      </w:pPr>
+      <w:rPr>
+        <w:rFonts w:ascii="Wingdings" w:hAnsi="Wingdings" w:hint="default"/>
+        <w:sz w:val="20"/>
+      </w:rPr>
+    </w:lvl>
+  </w:abstractNum>
+  <w:abstractNum w:abstractNumId="9" w15:restartNumberingAfterBreak="0">
     <w:nsid w:val="30A313F7"/>
     <w:multiLevelType w:val="hybridMultilevel"/>
     <w:tmpl w:val="0E30B5C8"/>
@@ -5407,7 +8871,7 @@
       </w:rPr>
     </w:lvl>
   </w:abstractNum>
-  <w:abstractNum w:abstractNumId="3" w15:restartNumberingAfterBreak="0">
+  <w:abstractNum w:abstractNumId="10" w15:restartNumberingAfterBreak="0">
     <w:nsid w:val="391D54EA"/>
     <w:multiLevelType w:val="multilevel"/>
     <w:tmpl w:val="9D86C7BC"/>
@@ -5556,7 +9020,156 @@
       </w:rPr>
     </w:lvl>
   </w:abstractNum>
-  <w:abstractNum w:abstractNumId="4" w15:restartNumberingAfterBreak="0">
+  <w:abstractNum w:abstractNumId="11" w15:restartNumberingAfterBreak="0">
+    <w:nsid w:val="3F857F83"/>
+    <w:multiLevelType w:val="multilevel"/>
+    <w:tmpl w:val="294238AC"/>
+    <w:lvl w:ilvl="0">
+      <w:start w:val="1"/>
+      <w:numFmt w:val="bullet"/>
+      <w:lvlText w:val=""/>
+      <w:lvlJc w:val="left"/>
+      <w:pPr>
+        <w:tabs>
+          <w:tab w:val="num" w:pos="720"/>
+        </w:tabs>
+        <w:ind w:left="720" w:hanging="360"/>
+      </w:pPr>
+      <w:rPr>
+        <w:rFonts w:ascii="Symbol" w:hAnsi="Symbol" w:hint="default"/>
+        <w:sz w:val="20"/>
+      </w:rPr>
+    </w:lvl>
+    <w:lvl w:ilvl="1" w:tentative="1">
+      <w:start w:val="1"/>
+      <w:numFmt w:val="bullet"/>
+      <w:lvlText w:val="o"/>
+      <w:lvlJc w:val="left"/>
+      <w:pPr>
+        <w:tabs>
+          <w:tab w:val="num" w:pos="1440"/>
+        </w:tabs>
+        <w:ind w:left="1440" w:hanging="360"/>
+      </w:pPr>
+      <w:rPr>
+        <w:rFonts w:ascii="Courier New" w:hAnsi="Courier New" w:hint="default"/>
+        <w:sz w:val="20"/>
+      </w:rPr>
+    </w:lvl>
+    <w:lvl w:ilvl="2" w:tentative="1">
+      <w:start w:val="1"/>
+      <w:numFmt w:val="bullet"/>
+      <w:lvlText w:val=""/>
+      <w:lvlJc w:val="left"/>
+      <w:pPr>
+        <w:tabs>
+          <w:tab w:val="num" w:pos="2160"/>
+        </w:tabs>
+        <w:ind w:left="2160" w:hanging="360"/>
+      </w:pPr>
+      <w:rPr>
+        <w:rFonts w:ascii="Wingdings" w:hAnsi="Wingdings" w:hint="default"/>
+        <w:sz w:val="20"/>
+      </w:rPr>
+    </w:lvl>
+    <w:lvl w:ilvl="3" w:tentative="1">
+      <w:start w:val="1"/>
+      <w:numFmt w:val="bullet"/>
+      <w:lvlText w:val=""/>
+      <w:lvlJc w:val="left"/>
+      <w:pPr>
+        <w:tabs>
+          <w:tab w:val="num" w:pos="2880"/>
+        </w:tabs>
+        <w:ind w:left="2880" w:hanging="360"/>
+      </w:pPr>
+      <w:rPr>
+        <w:rFonts w:ascii="Wingdings" w:hAnsi="Wingdings" w:hint="default"/>
+        <w:sz w:val="20"/>
+      </w:rPr>
+    </w:lvl>
+    <w:lvl w:ilvl="4" w:tentative="1">
+      <w:start w:val="1"/>
+      <w:numFmt w:val="bullet"/>
+      <w:lvlText w:val=""/>
+      <w:lvlJc w:val="left"/>
+      <w:pPr>
+        <w:tabs>
+          <w:tab w:val="num" w:pos="3600"/>
+        </w:tabs>
+        <w:ind w:left="3600" w:hanging="360"/>
+      </w:pPr>
+      <w:rPr>
+        <w:rFonts w:ascii="Wingdings" w:hAnsi="Wingdings" w:hint="default"/>
+        <w:sz w:val="20"/>
+      </w:rPr>
+    </w:lvl>
+    <w:lvl w:ilvl="5" w:tentative="1">
+      <w:start w:val="1"/>
+      <w:numFmt w:val="bullet"/>
+      <w:lvlText w:val=""/>
+      <w:lvlJc w:val="left"/>
+      <w:pPr>
+        <w:tabs>
+          <w:tab w:val="num" w:pos="4320"/>
+        </w:tabs>
+        <w:ind w:left="4320" w:hanging="360"/>
+      </w:pPr>
+      <w:rPr>
+        <w:rFonts w:ascii="Wingdings" w:hAnsi="Wingdings" w:hint="default"/>
+        <w:sz w:val="20"/>
+      </w:rPr>
+    </w:lvl>
+    <w:lvl w:ilvl="6" w:tentative="1">
+      <w:start w:val="1"/>
+      <w:numFmt w:val="bullet"/>
+      <w:lvlText w:val=""/>
+      <w:lvlJc w:val="left"/>
+      <w:pPr>
+        <w:tabs>
+          <w:tab w:val="num" w:pos="5040"/>
+        </w:tabs>
+        <w:ind w:left="5040" w:hanging="360"/>
+      </w:pPr>
+      <w:rPr>
+        <w:rFonts w:ascii="Wingdings" w:hAnsi="Wingdings" w:hint="default"/>
+        <w:sz w:val="20"/>
+      </w:rPr>
+    </w:lvl>
+    <w:lvl w:ilvl="7" w:tentative="1">
+      <w:start w:val="1"/>
+      <w:numFmt w:val="bullet"/>
+      <w:lvlText w:val=""/>
+      <w:lvlJc w:val="left"/>
+      <w:pPr>
+        <w:tabs>
+          <w:tab w:val="num" w:pos="5760"/>
+        </w:tabs>
+        <w:ind w:left="5760" w:hanging="360"/>
+      </w:pPr>
+      <w:rPr>
+        <w:rFonts w:ascii="Wingdings" w:hAnsi="Wingdings" w:hint="default"/>
+        <w:sz w:val="20"/>
+      </w:rPr>
+    </w:lvl>
+    <w:lvl w:ilvl="8" w:tentative="1">
+      <w:start w:val="1"/>
+      <w:numFmt w:val="bullet"/>
+      <w:lvlText w:val=""/>
+      <w:lvlJc w:val="left"/>
+      <w:pPr>
+        <w:tabs>
+          <w:tab w:val="num" w:pos="6480"/>
+        </w:tabs>
+        <w:ind w:left="6480" w:hanging="360"/>
+      </w:pPr>
+      <w:rPr>
+        <w:rFonts w:ascii="Wingdings" w:hAnsi="Wingdings" w:hint="default"/>
+        <w:sz w:val="20"/>
+      </w:rPr>
+    </w:lvl>
+  </w:abstractNum>
+  <w:abstractNum w:abstractNumId="12" w15:restartNumberingAfterBreak="0">
     <w:nsid w:val="4D2F53DB"/>
     <w:multiLevelType w:val="multilevel"/>
     <w:tmpl w:val="96FE1210"/>
@@ -5705,7 +9318,156 @@
       </w:rPr>
     </w:lvl>
   </w:abstractNum>
-  <w:abstractNum w:abstractNumId="5" w15:restartNumberingAfterBreak="0">
+  <w:abstractNum w:abstractNumId="13" w15:restartNumberingAfterBreak="0">
+    <w:nsid w:val="616F2407"/>
+    <w:multiLevelType w:val="multilevel"/>
+    <w:tmpl w:val="BC0E13A8"/>
+    <w:lvl w:ilvl="0">
+      <w:start w:val="1"/>
+      <w:numFmt w:val="bullet"/>
+      <w:lvlText w:val=""/>
+      <w:lvlJc w:val="left"/>
+      <w:pPr>
+        <w:tabs>
+          <w:tab w:val="num" w:pos="720"/>
+        </w:tabs>
+        <w:ind w:left="720" w:hanging="360"/>
+      </w:pPr>
+      <w:rPr>
+        <w:rFonts w:ascii="Symbol" w:hAnsi="Symbol" w:hint="default"/>
+        <w:sz w:val="20"/>
+      </w:rPr>
+    </w:lvl>
+    <w:lvl w:ilvl="1" w:tentative="1">
+      <w:start w:val="1"/>
+      <w:numFmt w:val="bullet"/>
+      <w:lvlText w:val="o"/>
+      <w:lvlJc w:val="left"/>
+      <w:pPr>
+        <w:tabs>
+          <w:tab w:val="num" w:pos="1440"/>
+        </w:tabs>
+        <w:ind w:left="1440" w:hanging="360"/>
+      </w:pPr>
+      <w:rPr>
+        <w:rFonts w:ascii="Courier New" w:hAnsi="Courier New" w:hint="default"/>
+        <w:sz w:val="20"/>
+      </w:rPr>
+    </w:lvl>
+    <w:lvl w:ilvl="2" w:tentative="1">
+      <w:start w:val="1"/>
+      <w:numFmt w:val="bullet"/>
+      <w:lvlText w:val=""/>
+      <w:lvlJc w:val="left"/>
+      <w:pPr>
+        <w:tabs>
+          <w:tab w:val="num" w:pos="2160"/>
+        </w:tabs>
+        <w:ind w:left="2160" w:hanging="360"/>
+      </w:pPr>
+      <w:rPr>
+        <w:rFonts w:ascii="Wingdings" w:hAnsi="Wingdings" w:hint="default"/>
+        <w:sz w:val="20"/>
+      </w:rPr>
+    </w:lvl>
+    <w:lvl w:ilvl="3" w:tentative="1">
+      <w:start w:val="1"/>
+      <w:numFmt w:val="bullet"/>
+      <w:lvlText w:val=""/>
+      <w:lvlJc w:val="left"/>
+      <w:pPr>
+        <w:tabs>
+          <w:tab w:val="num" w:pos="2880"/>
+        </w:tabs>
+        <w:ind w:left="2880" w:hanging="360"/>
+      </w:pPr>
+      <w:rPr>
+        <w:rFonts w:ascii="Wingdings" w:hAnsi="Wingdings" w:hint="default"/>
+        <w:sz w:val="20"/>
+      </w:rPr>
+    </w:lvl>
+    <w:lvl w:ilvl="4" w:tentative="1">
+      <w:start w:val="1"/>
+      <w:numFmt w:val="bullet"/>
+      <w:lvlText w:val=""/>
+      <w:lvlJc w:val="left"/>
+      <w:pPr>
+        <w:tabs>
+          <w:tab w:val="num" w:pos="3600"/>
+        </w:tabs>
+        <w:ind w:left="3600" w:hanging="360"/>
+      </w:pPr>
+      <w:rPr>
+        <w:rFonts w:ascii="Wingdings" w:hAnsi="Wingdings" w:hint="default"/>
+        <w:sz w:val="20"/>
+      </w:rPr>
+    </w:lvl>
+    <w:lvl w:ilvl="5" w:tentative="1">
+      <w:start w:val="1"/>
+      <w:numFmt w:val="bullet"/>
+      <w:lvlText w:val=""/>
+      <w:lvlJc w:val="left"/>
+      <w:pPr>
+        <w:tabs>
+          <w:tab w:val="num" w:pos="4320"/>
+        </w:tabs>
+        <w:ind w:left="4320" w:hanging="360"/>
+      </w:pPr>
+      <w:rPr>
+        <w:rFonts w:ascii="Wingdings" w:hAnsi="Wingdings" w:hint="default"/>
+        <w:sz w:val="20"/>
+      </w:rPr>
+    </w:lvl>
+    <w:lvl w:ilvl="6" w:tentative="1">
+      <w:start w:val="1"/>
+      <w:numFmt w:val="bullet"/>
+      <w:lvlText w:val=""/>
+      <w:lvlJc w:val="left"/>
+      <w:pPr>
+        <w:tabs>
+          <w:tab w:val="num" w:pos="5040"/>
+        </w:tabs>
+        <w:ind w:left="5040" w:hanging="360"/>
+      </w:pPr>
+      <w:rPr>
+        <w:rFonts w:ascii="Wingdings" w:hAnsi="Wingdings" w:hint="default"/>
+        <w:sz w:val="20"/>
+      </w:rPr>
+    </w:lvl>
+    <w:lvl w:ilvl="7" w:tentative="1">
+      <w:start w:val="1"/>
+      <w:numFmt w:val="bullet"/>
+      <w:lvlText w:val=""/>
+      <w:lvlJc w:val="left"/>
+      <w:pPr>
+        <w:tabs>
+          <w:tab w:val="num" w:pos="5760"/>
+        </w:tabs>
+        <w:ind w:left="5760" w:hanging="360"/>
+      </w:pPr>
+      <w:rPr>
+        <w:rFonts w:ascii="Wingdings" w:hAnsi="Wingdings" w:hint="default"/>
+        <w:sz w:val="20"/>
+      </w:rPr>
+    </w:lvl>
+    <w:lvl w:ilvl="8" w:tentative="1">
+      <w:start w:val="1"/>
+      <w:numFmt w:val="bullet"/>
+      <w:lvlText w:val=""/>
+      <w:lvlJc w:val="left"/>
+      <w:pPr>
+        <w:tabs>
+          <w:tab w:val="num" w:pos="6480"/>
+        </w:tabs>
+        <w:ind w:left="6480" w:hanging="360"/>
+      </w:pPr>
+      <w:rPr>
+        <w:rFonts w:ascii="Wingdings" w:hAnsi="Wingdings" w:hint="default"/>
+        <w:sz w:val="20"/>
+      </w:rPr>
+    </w:lvl>
+  </w:abstractNum>
+  <w:abstractNum w:abstractNumId="14" w15:restartNumberingAfterBreak="0">
     <w:nsid w:val="674E6589"/>
     <w:multiLevelType w:val="hybridMultilevel"/>
     <w:tmpl w:val="427E6EA0"/>
@@ -5794,7 +9556,7 @@
       </w:pPr>
     </w:lvl>
   </w:abstractNum>
-  <w:abstractNum w:abstractNumId="6" w15:restartNumberingAfterBreak="0">
+  <w:abstractNum w:abstractNumId="15" w15:restartNumberingAfterBreak="0">
     <w:nsid w:val="6BFA26CC"/>
     <w:multiLevelType w:val="multilevel"/>
     <w:tmpl w:val="2FBCAB92"/>
@@ -5943,7 +9705,156 @@
       </w:rPr>
     </w:lvl>
   </w:abstractNum>
-  <w:abstractNum w:abstractNumId="7" w15:restartNumberingAfterBreak="0">
+  <w:abstractNum w:abstractNumId="16" w15:restartNumberingAfterBreak="0">
+    <w:nsid w:val="7F0F2C0E"/>
+    <w:multiLevelType w:val="multilevel"/>
+    <w:tmpl w:val="C6C635A0"/>
+    <w:lvl w:ilvl="0">
+      <w:start w:val="1"/>
+      <w:numFmt w:val="bullet"/>
+      <w:lvlText w:val=""/>
+      <w:lvlJc w:val="left"/>
+      <w:pPr>
+        <w:tabs>
+          <w:tab w:val="num" w:pos="720"/>
+        </w:tabs>
+        <w:ind w:left="720" w:hanging="360"/>
+      </w:pPr>
+      <w:rPr>
+        <w:rFonts w:ascii="Symbol" w:hAnsi="Symbol" w:hint="default"/>
+        <w:sz w:val="20"/>
+      </w:rPr>
+    </w:lvl>
+    <w:lvl w:ilvl="1" w:tentative="1">
+      <w:start w:val="1"/>
+      <w:numFmt w:val="bullet"/>
+      <w:lvlText w:val="o"/>
+      <w:lvlJc w:val="left"/>
+      <w:pPr>
+        <w:tabs>
+          <w:tab w:val="num" w:pos="1440"/>
+        </w:tabs>
+        <w:ind w:left="1440" w:hanging="360"/>
+      </w:pPr>
+      <w:rPr>
+        <w:rFonts w:ascii="Courier New" w:hAnsi="Courier New" w:hint="default"/>
+        <w:sz w:val="20"/>
+      </w:rPr>
+    </w:lvl>
+    <w:lvl w:ilvl="2" w:tentative="1">
+      <w:start w:val="1"/>
+      <w:numFmt w:val="bullet"/>
+      <w:lvlText w:val=""/>
+      <w:lvlJc w:val="left"/>
+      <w:pPr>
+        <w:tabs>
+          <w:tab w:val="num" w:pos="2160"/>
+        </w:tabs>
+        <w:ind w:left="2160" w:hanging="360"/>
+      </w:pPr>
+      <w:rPr>
+        <w:rFonts w:ascii="Wingdings" w:hAnsi="Wingdings" w:hint="default"/>
+        <w:sz w:val="20"/>
+      </w:rPr>
+    </w:lvl>
+    <w:lvl w:ilvl="3" w:tentative="1">
+      <w:start w:val="1"/>
+      <w:numFmt w:val="bullet"/>
+      <w:lvlText w:val=""/>
+      <w:lvlJc w:val="left"/>
+      <w:pPr>
+        <w:tabs>
+          <w:tab w:val="num" w:pos="2880"/>
+        </w:tabs>
+        <w:ind w:left="2880" w:hanging="360"/>
+      </w:pPr>
+      <w:rPr>
+        <w:rFonts w:ascii="Wingdings" w:hAnsi="Wingdings" w:hint="default"/>
+        <w:sz w:val="20"/>
+      </w:rPr>
+    </w:lvl>
+    <w:lvl w:ilvl="4" w:tentative="1">
+      <w:start w:val="1"/>
+      <w:numFmt w:val="bullet"/>
+      <w:lvlText w:val=""/>
+      <w:lvlJc w:val="left"/>
+      <w:pPr>
+        <w:tabs>
+          <w:tab w:val="num" w:pos="3600"/>
+        </w:tabs>
+        <w:ind w:left="3600" w:hanging="360"/>
+      </w:pPr>
+      <w:rPr>
+        <w:rFonts w:ascii="Wingdings" w:hAnsi="Wingdings" w:hint="default"/>
+        <w:sz w:val="20"/>
+      </w:rPr>
+    </w:lvl>
+    <w:lvl w:ilvl="5" w:tentative="1">
+      <w:start w:val="1"/>
+      <w:numFmt w:val="bullet"/>
+      <w:lvlText w:val=""/>
+      <w:lvlJc w:val="left"/>
+      <w:pPr>
+        <w:tabs>
+          <w:tab w:val="num" w:pos="4320"/>
+        </w:tabs>
+        <w:ind w:left="4320" w:hanging="360"/>
+      </w:pPr>
+      <w:rPr>
+        <w:rFonts w:ascii="Wingdings" w:hAnsi="Wingdings" w:hint="default"/>
+        <w:sz w:val="20"/>
+      </w:rPr>
+    </w:lvl>
+    <w:lvl w:ilvl="6" w:tentative="1">
+      <w:start w:val="1"/>
+      <w:numFmt w:val="bullet"/>
+      <w:lvlText w:val=""/>
+      <w:lvlJc w:val="left"/>
+      <w:pPr>
+        <w:tabs>
+          <w:tab w:val="num" w:pos="5040"/>
+        </w:tabs>
+        <w:ind w:left="5040" w:hanging="360"/>
+      </w:pPr>
+      <w:rPr>
+        <w:rFonts w:ascii="Wingdings" w:hAnsi="Wingdings" w:hint="default"/>
+        <w:sz w:val="20"/>
+      </w:rPr>
+    </w:lvl>
+    <w:lvl w:ilvl="7" w:tentative="1">
+      <w:start w:val="1"/>
+      <w:numFmt w:val="bullet"/>
+      <w:lvlText w:val=""/>
+      <w:lvlJc w:val="left"/>
+      <w:pPr>
+        <w:tabs>
+          <w:tab w:val="num" w:pos="5760"/>
+        </w:tabs>
+        <w:ind w:left="5760" w:hanging="360"/>
+      </w:pPr>
+      <w:rPr>
+        <w:rFonts w:ascii="Wingdings" w:hAnsi="Wingdings" w:hint="default"/>
+        <w:sz w:val="20"/>
+      </w:rPr>
+    </w:lvl>
+    <w:lvl w:ilvl="8" w:tentative="1">
+      <w:start w:val="1"/>
+      <w:numFmt w:val="bullet"/>
+      <w:lvlText w:val=""/>
+      <w:lvlJc w:val="left"/>
+      <w:pPr>
+        <w:tabs>
+          <w:tab w:val="num" w:pos="6480"/>
+        </w:tabs>
+        <w:ind w:left="6480" w:hanging="360"/>
+      </w:pPr>
+      <w:rPr>
+        <w:rFonts w:ascii="Wingdings" w:hAnsi="Wingdings" w:hint="default"/>
+        <w:sz w:val="20"/>
+      </w:rPr>
+    </w:lvl>
+  </w:abstractNum>
+  <w:abstractNum w:abstractNumId="17" w15:restartNumberingAfterBreak="0">
     <w:nsid w:val="7FF23537"/>
     <w:multiLevelType w:val="multilevel"/>
     <w:tmpl w:val="907E9F84"/>
@@ -6093,28 +10004,58 @@
     </w:lvl>
   </w:abstractNum>
   <w:num w:numId="1" w16cid:durableId="1101295347">
-    <w:abstractNumId w:val="2"/>
+    <w:abstractNumId w:val="9"/>
   </w:num>
   <w:num w:numId="2" w16cid:durableId="1067260753">
-    <w:abstractNumId w:val="5"/>
+    <w:abstractNumId w:val="14"/>
   </w:num>
   <w:num w:numId="3" w16cid:durableId="1421757388">
-    <w:abstractNumId w:val="1"/>
+    <w:abstractNumId w:val="3"/>
   </w:num>
   <w:num w:numId="4" w16cid:durableId="388967388">
-    <w:abstractNumId w:val="3"/>
+    <w:abstractNumId w:val="10"/>
   </w:num>
   <w:num w:numId="5" w16cid:durableId="511261899">
-    <w:abstractNumId w:val="4"/>
+    <w:abstractNumId w:val="12"/>
   </w:num>
   <w:num w:numId="6" w16cid:durableId="1293710252">
-    <w:abstractNumId w:val="6"/>
+    <w:abstractNumId w:val="15"/>
   </w:num>
   <w:num w:numId="7" w16cid:durableId="1520587924">
     <w:abstractNumId w:val="0"/>
   </w:num>
   <w:num w:numId="8" w16cid:durableId="25765069">
+    <w:abstractNumId w:val="17"/>
+  </w:num>
+  <w:num w:numId="9" w16cid:durableId="2029678661">
     <w:abstractNumId w:val="7"/>
+  </w:num>
+  <w:num w:numId="10" w16cid:durableId="1189872028">
+    <w:abstractNumId w:val="8"/>
+  </w:num>
+  <w:num w:numId="11" w16cid:durableId="553855907">
+    <w:abstractNumId w:val="2"/>
+  </w:num>
+  <w:num w:numId="12" w16cid:durableId="946274306">
+    <w:abstractNumId w:val="13"/>
+  </w:num>
+  <w:num w:numId="13" w16cid:durableId="1283726271">
+    <w:abstractNumId w:val="16"/>
+  </w:num>
+  <w:num w:numId="14" w16cid:durableId="612591012">
+    <w:abstractNumId w:val="5"/>
+  </w:num>
+  <w:num w:numId="15" w16cid:durableId="1315140889">
+    <w:abstractNumId w:val="11"/>
+  </w:num>
+  <w:num w:numId="16" w16cid:durableId="798954559">
+    <w:abstractNumId w:val="1"/>
+  </w:num>
+  <w:num w:numId="17" w16cid:durableId="507450829">
+    <w:abstractNumId w:val="4"/>
+  </w:num>
+  <w:num w:numId="18" w16cid:durableId="1050377311">
+    <w:abstractNumId w:val="6"/>
   </w:num>
 </w:numbering>
 </file>
@@ -7049,6 +10990,36 @@
       </w:tblBorders>
     </w:tblPr>
   </w:style>
+  <w:style w:type="paragraph" w:styleId="FormtovanvHTML">
+    <w:name w:val="HTML Preformatted"/>
+    <w:basedOn w:val="Normln"/>
+    <w:link w:val="FormtovanvHTMLChar"/>
+    <w:uiPriority w:val="99"/>
+    <w:semiHidden/>
+    <w:unhideWhenUsed/>
+    <w:rsid w:val="00D666B6"/>
+    <w:pPr>
+      <w:spacing w:after="0" w:line="240" w:lineRule="auto"/>
+    </w:pPr>
+    <w:rPr>
+      <w:rFonts w:ascii="Consolas" w:hAnsi="Consolas"/>
+      <w:sz w:val="20"/>
+      <w:szCs w:val="20"/>
+    </w:rPr>
+  </w:style>
+  <w:style w:type="character" w:customStyle="1" w:styleId="FormtovanvHTMLChar">
+    <w:name w:val="Formátovaný v HTML Char"/>
+    <w:basedOn w:val="Standardnpsmoodstavce"/>
+    <w:link w:val="FormtovanvHTML"/>
+    <w:uiPriority w:val="99"/>
+    <w:semiHidden/>
+    <w:rsid w:val="00D666B6"/>
+    <w:rPr>
+      <w:rFonts w:ascii="Consolas" w:hAnsi="Consolas"/>
+      <w:sz w:val="20"/>
+      <w:szCs w:val="20"/>
+    </w:rPr>
+  </w:style>
 </w:styles>
 </file>
 

</xml_diff>